<commit_message>
modification du tableau de compétence
</commit_message>
<xml_diff>
--- a/PDF/chetouani-veille.docx
+++ b/PDF/chetouani-veille.docx
@@ -174,409 +174,14 @@
     </w:p>
     <w:p>
       <w:pPr>
-        <w:pStyle w:val="Corpsdetexte"/>
+        <w:pStyle w:val="Titre1"/>
+        <w:spacing w:before="1"/>
+        <w:ind w:left="0"/>
         <w:jc w:val="both"/>
         <w:rPr>
-          <w:sz w:val="36"/>
-        </w:rPr>
-      </w:pPr>
-    </w:p>
-    <w:p>
-      <w:pPr>
-        <w:pStyle w:val="Corpsdetexte"/>
-        <w:spacing w:before="89"/>
-        <w:jc w:val="both"/>
-        <w:rPr>
-          <w:sz w:val="36"/>
-        </w:rPr>
-      </w:pPr>
-    </w:p>
-    <w:p>
-      <w:pPr>
-        <w:pStyle w:val="Titre1"/>
-        <w:jc w:val="both"/>
-        <w:rPr>
-          <w:u w:val="none"/>
-        </w:rPr>
-      </w:pPr>
-      <w:r>
-        <w:rPr>
-          <w:spacing w:val="-10"/>
-          <w:u w:val="none"/>
-        </w:rPr>
-        <w:t>Définition</w:t>
-      </w:r>
-      <w:r>
-        <w:rPr>
-          <w:spacing w:val="-25"/>
-          <w:u w:val="none"/>
-        </w:rPr>
-        <w:t xml:space="preserve"> </w:t>
-      </w:r>
-      <w:r>
-        <w:rPr>
-          <w:spacing w:val="-10"/>
-          <w:u w:val="none"/>
-        </w:rPr>
-        <w:t>du</w:t>
-      </w:r>
-      <w:r>
-        <w:rPr>
-          <w:spacing w:val="-27"/>
-          <w:u w:val="none"/>
-        </w:rPr>
-        <w:t xml:space="preserve"> </w:t>
-      </w:r>
-      <w:r>
-        <w:rPr>
-          <w:spacing w:val="-10"/>
-          <w:u w:val="none"/>
-        </w:rPr>
-        <w:t>périmètre</w:t>
-      </w:r>
-      <w:r>
-        <w:rPr>
-          <w:spacing w:val="-22"/>
-          <w:u w:val="none"/>
-        </w:rPr>
-        <w:t xml:space="preserve"> </w:t>
-      </w:r>
-      <w:r>
-        <w:rPr>
-          <w:spacing w:val="-10"/>
-          <w:u w:val="none"/>
-        </w:rPr>
-        <w:t>de</w:t>
-      </w:r>
-      <w:r>
-        <w:rPr>
-          <w:spacing w:val="-27"/>
-          <w:u w:val="none"/>
-        </w:rPr>
-        <w:t xml:space="preserve"> </w:t>
-      </w:r>
-      <w:r>
-        <w:rPr>
-          <w:spacing w:val="-10"/>
-          <w:u w:val="none"/>
-        </w:rPr>
-        <w:t>la</w:t>
-      </w:r>
-      <w:r>
-        <w:rPr>
-          <w:spacing w:val="-23"/>
-          <w:u w:val="none"/>
-        </w:rPr>
-        <w:t xml:space="preserve"> </w:t>
-      </w:r>
-      <w:r>
-        <w:rPr>
-          <w:spacing w:val="-10"/>
-          <w:u w:val="none"/>
-        </w:rPr>
-        <w:t>veille</w:t>
-      </w:r>
-      <w:r>
-        <w:rPr>
-          <w:spacing w:val="-15"/>
-          <w:u w:val="none"/>
-        </w:rPr>
-        <w:t xml:space="preserve"> </w:t>
-      </w:r>
-      <w:r>
-        <w:rPr>
-          <w:spacing w:val="-10"/>
-          <w:u w:val="none"/>
-        </w:rPr>
-        <w:t>:</w:t>
-      </w:r>
-    </w:p>
-    <w:p>
-      <w:pPr>
-        <w:pStyle w:val="Corpsdetexte"/>
-        <w:spacing w:before="237" w:line="292" w:lineRule="auto"/>
-        <w:ind w:left="141" w:right="143"/>
-        <w:jc w:val="both"/>
-      </w:pPr>
-      <w:r>
-        <w:rPr>
-          <w:spacing w:val="-4"/>
-        </w:rPr>
-        <w:t>Pour</w:t>
-      </w:r>
-      <w:r>
-        <w:rPr>
-          <w:spacing w:val="-10"/>
-        </w:rPr>
-        <w:t xml:space="preserve"> </w:t>
-      </w:r>
-      <w:r>
-        <w:rPr>
-          <w:spacing w:val="-4"/>
-        </w:rPr>
-        <w:t>mon</w:t>
-      </w:r>
-      <w:r>
-        <w:rPr>
-          <w:spacing w:val="-13"/>
-        </w:rPr>
-        <w:t xml:space="preserve"> </w:t>
-      </w:r>
-      <w:r>
-        <w:rPr>
-          <w:spacing w:val="-4"/>
-        </w:rPr>
-        <w:t>cas,</w:t>
-      </w:r>
-      <w:r>
-        <w:rPr>
-          <w:spacing w:val="-11"/>
-        </w:rPr>
-        <w:t xml:space="preserve"> </w:t>
-      </w:r>
-      <w:r>
-        <w:rPr>
-          <w:spacing w:val="-4"/>
-        </w:rPr>
-        <w:t>le</w:t>
-      </w:r>
-      <w:r>
-        <w:rPr>
-          <w:spacing w:val="-12"/>
-        </w:rPr>
-        <w:t xml:space="preserve"> </w:t>
-      </w:r>
-      <w:r>
-        <w:rPr>
-          <w:spacing w:val="-4"/>
-        </w:rPr>
-        <w:t>périmètre</w:t>
-      </w:r>
-      <w:r>
-        <w:rPr>
-          <w:spacing w:val="-11"/>
-        </w:rPr>
-        <w:t xml:space="preserve"> </w:t>
-      </w:r>
-      <w:r>
-        <w:rPr>
-          <w:spacing w:val="-4"/>
-        </w:rPr>
-        <w:t>s’étendra</w:t>
-      </w:r>
-      <w:r>
-        <w:rPr>
-          <w:spacing w:val="-13"/>
-        </w:rPr>
-        <w:t xml:space="preserve"> </w:t>
-      </w:r>
-      <w:r>
-        <w:rPr>
-          <w:spacing w:val="-4"/>
-        </w:rPr>
-        <w:t>sur</w:t>
-      </w:r>
-      <w:r>
-        <w:rPr>
-          <w:spacing w:val="-10"/>
-        </w:rPr>
-        <w:t xml:space="preserve"> </w:t>
-      </w:r>
-      <w:r>
-        <w:rPr>
-          <w:spacing w:val="-4"/>
-        </w:rPr>
-        <w:t>les</w:t>
-      </w:r>
-      <w:r>
-        <w:rPr>
-          <w:spacing w:val="-14"/>
-        </w:rPr>
-        <w:t xml:space="preserve"> </w:t>
-      </w:r>
-      <w:r>
-        <w:rPr>
-          <w:spacing w:val="-4"/>
-        </w:rPr>
-        <w:t>langages</w:t>
-      </w:r>
-      <w:r>
-        <w:rPr>
-          <w:spacing w:val="-14"/>
-        </w:rPr>
-        <w:t xml:space="preserve"> </w:t>
-      </w:r>
-      <w:r>
-        <w:rPr>
-          <w:spacing w:val="-4"/>
-        </w:rPr>
-        <w:t>web</w:t>
-      </w:r>
-      <w:r>
-        <w:rPr>
-          <w:spacing w:val="-11"/>
-        </w:rPr>
-        <w:t xml:space="preserve"> </w:t>
-      </w:r>
-      <w:r>
-        <w:rPr>
-          <w:spacing w:val="-4"/>
-        </w:rPr>
-        <w:t>basique</w:t>
-      </w:r>
-      <w:r>
-        <w:rPr>
-          <w:spacing w:val="-11"/>
-        </w:rPr>
-        <w:t xml:space="preserve"> </w:t>
-      </w:r>
-      <w:r>
-        <w:rPr>
-          <w:spacing w:val="-4"/>
-        </w:rPr>
-        <w:t xml:space="preserve">comme </w:t>
-      </w:r>
-      <w:r>
-        <w:t xml:space="preserve">HTML, CSS et JS jusqu’aux </w:t>
-      </w:r>
-      <w:proofErr w:type="spellStart"/>
-      <w:r>
-        <w:t>frameworks</w:t>
-      </w:r>
-      <w:proofErr w:type="spellEnd"/>
-      <w:r>
-        <w:t xml:space="preserve"> plus spécifiques comme Vue.js, </w:t>
-      </w:r>
-      <w:proofErr w:type="spellStart"/>
-      <w:r>
-        <w:t>React</w:t>
-      </w:r>
-      <w:proofErr w:type="spellEnd"/>
-      <w:r>
-        <w:t xml:space="preserve"> ou encore Flask.</w:t>
-      </w:r>
-    </w:p>
-    <w:p>
-      <w:pPr>
-        <w:pStyle w:val="Corpsdetexte"/>
-        <w:jc w:val="both"/>
-      </w:pPr>
-    </w:p>
-    <w:p>
-      <w:pPr>
-        <w:pStyle w:val="Corpsdetexte"/>
-        <w:spacing w:before="67"/>
-        <w:jc w:val="both"/>
-      </w:pPr>
-    </w:p>
-    <w:p>
-      <w:pPr>
-        <w:pStyle w:val="Titre1"/>
-        <w:jc w:val="both"/>
-        <w:rPr>
-          <w:u w:val="none"/>
-        </w:rPr>
-      </w:pPr>
-      <w:r>
-        <w:rPr>
-          <w:spacing w:val="-8"/>
-          <w:u w:val="none"/>
-        </w:rPr>
-        <w:t>La</w:t>
-      </w:r>
-      <w:r>
-        <w:rPr>
-          <w:spacing w:val="-22"/>
-          <w:u w:val="none"/>
-        </w:rPr>
-        <w:t xml:space="preserve"> </w:t>
-      </w:r>
-      <w:r>
-        <w:rPr>
-          <w:spacing w:val="-8"/>
-          <w:u w:val="none"/>
-        </w:rPr>
-        <w:t>recherche</w:t>
-      </w:r>
-      <w:r>
-        <w:rPr>
-          <w:spacing w:val="-25"/>
-          <w:u w:val="none"/>
-        </w:rPr>
-        <w:t xml:space="preserve"> </w:t>
-      </w:r>
-      <w:r>
-        <w:rPr>
-          <w:spacing w:val="-8"/>
-          <w:u w:val="none"/>
-        </w:rPr>
-        <w:t>de</w:t>
-      </w:r>
-      <w:r>
-        <w:rPr>
-          <w:spacing w:val="-30"/>
-          <w:u w:val="none"/>
-        </w:rPr>
-        <w:t xml:space="preserve"> </w:t>
-      </w:r>
-      <w:r>
-        <w:rPr>
-          <w:spacing w:val="-8"/>
-          <w:u w:val="none"/>
-        </w:rPr>
-        <w:t>l’information</w:t>
-      </w:r>
-      <w:r>
-        <w:rPr>
-          <w:spacing w:val="-21"/>
-          <w:u w:val="none"/>
-        </w:rPr>
-        <w:t xml:space="preserve"> </w:t>
-      </w:r>
-      <w:r>
-        <w:rPr>
-          <w:spacing w:val="-10"/>
-          <w:u w:val="none"/>
-        </w:rPr>
-        <w:t>:</w:t>
-      </w:r>
-    </w:p>
-    <w:p>
-      <w:pPr>
-        <w:pStyle w:val="Corpsdetexte"/>
-        <w:spacing w:before="238" w:line="292" w:lineRule="auto"/>
-        <w:ind w:left="141" w:right="140"/>
-        <w:jc w:val="both"/>
-      </w:pPr>
-      <w:r>
-        <w:t xml:space="preserve">Les sites officiels de chaque technologie comme Flask, </w:t>
-      </w:r>
-      <w:proofErr w:type="spellStart"/>
-      <w:r>
-        <w:t>React</w:t>
-      </w:r>
-      <w:proofErr w:type="spellEnd"/>
-      <w:r>
-        <w:t xml:space="preserve"> ou Vue permettent de comprendre comment ils fonctionnent et comment les </w:t>
-      </w:r>
-      <w:r>
-        <w:rPr>
-          <w:spacing w:val="-2"/>
-        </w:rPr>
-        <w:t>utiliser</w:t>
-      </w:r>
-    </w:p>
-    <w:p>
-      <w:pPr>
-        <w:pStyle w:val="Corpsdetexte"/>
-        <w:jc w:val="both"/>
-      </w:pPr>
-    </w:p>
-    <w:p>
-      <w:pPr>
-        <w:pStyle w:val="Corpsdetexte"/>
-        <w:spacing w:before="66"/>
-        <w:jc w:val="both"/>
+          <w:spacing w:val="-10"/>
+          <w:u w:val="none"/>
+        </w:rPr>
       </w:pPr>
     </w:p>
     <w:p>
@@ -585,916 +190,21 @@
         <w:spacing w:before="1"/>
         <w:jc w:val="both"/>
         <w:rPr>
-          <w:u w:val="none"/>
-        </w:rPr>
-      </w:pPr>
-      <w:r>
-        <w:rPr>
-          <w:spacing w:val="-6"/>
-          <w:u w:val="none"/>
-        </w:rPr>
-        <w:t>Classer</w:t>
-      </w:r>
-      <w:r>
-        <w:rPr>
-          <w:spacing w:val="-22"/>
-          <w:u w:val="none"/>
-        </w:rPr>
-        <w:t xml:space="preserve"> </w:t>
-      </w:r>
-      <w:r>
-        <w:rPr>
-          <w:spacing w:val="-6"/>
-          <w:u w:val="none"/>
-        </w:rPr>
-        <w:t>l’information</w:t>
-      </w:r>
-      <w:r>
-        <w:rPr>
-          <w:spacing w:val="-16"/>
-          <w:u w:val="none"/>
-        </w:rPr>
-        <w:t xml:space="preserve"> </w:t>
-      </w:r>
-      <w:r>
-        <w:rPr>
-          <w:spacing w:val="-10"/>
-          <w:u w:val="none"/>
-        </w:rPr>
-        <w:t>:</w:t>
-      </w:r>
-    </w:p>
-    <w:p>
-      <w:pPr>
-        <w:pStyle w:val="Corpsdetexte"/>
-        <w:spacing w:before="242" w:line="290" w:lineRule="auto"/>
-        <w:ind w:left="141"/>
-        <w:jc w:val="both"/>
-      </w:pPr>
-      <w:r>
-        <w:rPr>
-          <w:spacing w:val="-6"/>
-        </w:rPr>
-        <w:t>J’ai</w:t>
-      </w:r>
-      <w:r>
-        <w:rPr>
-          <w:spacing w:val="-22"/>
-        </w:rPr>
-        <w:t xml:space="preserve"> </w:t>
-      </w:r>
-      <w:r>
-        <w:rPr>
-          <w:spacing w:val="-6"/>
-        </w:rPr>
-        <w:t>personnellement</w:t>
-      </w:r>
-      <w:r>
-        <w:rPr>
-          <w:spacing w:val="-21"/>
-        </w:rPr>
-        <w:t xml:space="preserve"> </w:t>
-      </w:r>
-      <w:r>
-        <w:rPr>
-          <w:spacing w:val="-6"/>
-        </w:rPr>
-        <w:t>utilisé</w:t>
-      </w:r>
-      <w:r>
-        <w:rPr>
-          <w:spacing w:val="-21"/>
-        </w:rPr>
-        <w:t xml:space="preserve"> </w:t>
-      </w:r>
-      <w:r>
-        <w:rPr>
-          <w:spacing w:val="-6"/>
-        </w:rPr>
-        <w:t>un</w:t>
-      </w:r>
-      <w:r>
-        <w:rPr>
-          <w:spacing w:val="-22"/>
-        </w:rPr>
-        <w:t xml:space="preserve"> </w:t>
-      </w:r>
-      <w:r>
-        <w:rPr>
-          <w:spacing w:val="-6"/>
-        </w:rPr>
-        <w:t>bloc</w:t>
-      </w:r>
-      <w:r>
-        <w:rPr>
-          <w:spacing w:val="-25"/>
-        </w:rPr>
-        <w:t xml:space="preserve"> </w:t>
-      </w:r>
-      <w:r>
-        <w:rPr>
-          <w:spacing w:val="-6"/>
-        </w:rPr>
-        <w:t>note</w:t>
-      </w:r>
-      <w:r>
-        <w:rPr>
-          <w:spacing w:val="-21"/>
-        </w:rPr>
-        <w:t xml:space="preserve"> </w:t>
-      </w:r>
-      <w:r>
-        <w:rPr>
-          <w:spacing w:val="-6"/>
-        </w:rPr>
-        <w:t>ou</w:t>
-      </w:r>
-      <w:r>
-        <w:rPr>
-          <w:spacing w:val="-25"/>
-        </w:rPr>
-        <w:t xml:space="preserve"> </w:t>
-      </w:r>
-      <w:r>
-        <w:rPr>
-          <w:spacing w:val="-6"/>
-        </w:rPr>
-        <w:t>simplement</w:t>
-      </w:r>
-      <w:r>
-        <w:rPr>
-          <w:spacing w:val="-21"/>
-        </w:rPr>
-        <w:t xml:space="preserve"> </w:t>
-      </w:r>
-      <w:r>
-        <w:rPr>
-          <w:spacing w:val="-6"/>
-        </w:rPr>
-        <w:t>un</w:t>
-      </w:r>
-      <w:r>
-        <w:rPr>
-          <w:spacing w:val="-22"/>
-        </w:rPr>
-        <w:t xml:space="preserve"> </w:t>
-      </w:r>
-      <w:r>
-        <w:rPr>
-          <w:spacing w:val="-6"/>
-        </w:rPr>
-        <w:t>document</w:t>
-      </w:r>
-      <w:r>
-        <w:rPr>
-          <w:spacing w:val="-17"/>
-        </w:rPr>
-        <w:t xml:space="preserve"> </w:t>
-      </w:r>
-      <w:r>
-        <w:rPr>
-          <w:spacing w:val="-6"/>
-        </w:rPr>
-        <w:t xml:space="preserve">texte </w:t>
-      </w:r>
-      <w:r>
-        <w:t>où</w:t>
-      </w:r>
-      <w:r>
-        <w:rPr>
-          <w:spacing w:val="-19"/>
-        </w:rPr>
-        <w:t xml:space="preserve"> </w:t>
-      </w:r>
-      <w:r>
-        <w:t>les</w:t>
-      </w:r>
-      <w:r>
-        <w:rPr>
-          <w:spacing w:val="-18"/>
-        </w:rPr>
-        <w:t xml:space="preserve"> </w:t>
-      </w:r>
-      <w:r>
-        <w:t>informations</w:t>
-      </w:r>
-      <w:r>
-        <w:rPr>
-          <w:spacing w:val="-12"/>
-        </w:rPr>
-        <w:t xml:space="preserve"> </w:t>
-      </w:r>
-      <w:r>
-        <w:t>utiles</w:t>
-      </w:r>
-      <w:r>
-        <w:rPr>
-          <w:spacing w:val="-13"/>
-        </w:rPr>
-        <w:t xml:space="preserve"> </w:t>
-      </w:r>
-      <w:r>
-        <w:t>y</w:t>
-      </w:r>
-      <w:r>
-        <w:rPr>
-          <w:spacing w:val="-19"/>
-        </w:rPr>
-        <w:t xml:space="preserve"> </w:t>
-      </w:r>
-      <w:r>
-        <w:t>sont.</w:t>
-      </w:r>
-    </w:p>
-    <w:p>
-      <w:pPr>
-        <w:pStyle w:val="Corpsdetexte"/>
-        <w:spacing w:before="163"/>
-        <w:ind w:left="141"/>
-        <w:jc w:val="both"/>
-      </w:pPr>
-      <w:r>
-        <w:rPr>
-          <w:spacing w:val="-4"/>
-        </w:rPr>
-        <w:t>Ou</w:t>
-      </w:r>
-      <w:r>
-        <w:rPr>
-          <w:spacing w:val="-20"/>
-        </w:rPr>
-        <w:t xml:space="preserve"> </w:t>
-      </w:r>
-      <w:r>
-        <w:rPr>
-          <w:spacing w:val="-4"/>
-        </w:rPr>
-        <w:t>plus</w:t>
-      </w:r>
-      <w:r>
-        <w:rPr>
-          <w:spacing w:val="-19"/>
-        </w:rPr>
-        <w:t xml:space="preserve"> </w:t>
-      </w:r>
-      <w:r>
-        <w:rPr>
-          <w:spacing w:val="-4"/>
-        </w:rPr>
-        <w:t>simplement</w:t>
-      </w:r>
-      <w:r>
-        <w:rPr>
-          <w:spacing w:val="-10"/>
-        </w:rPr>
-        <w:t xml:space="preserve"> </w:t>
-      </w:r>
-      <w:r>
-        <w:rPr>
-          <w:spacing w:val="-4"/>
-        </w:rPr>
-        <w:t>mon</w:t>
-      </w:r>
-      <w:r>
-        <w:rPr>
-          <w:spacing w:val="-18"/>
-        </w:rPr>
-        <w:t xml:space="preserve"> </w:t>
-      </w:r>
-      <w:r>
-        <w:rPr>
-          <w:spacing w:val="-4"/>
-        </w:rPr>
-        <w:t>historique</w:t>
-      </w:r>
-      <w:r>
-        <w:rPr>
-          <w:spacing w:val="-17"/>
-        </w:rPr>
-        <w:t xml:space="preserve"> </w:t>
-      </w:r>
-      <w:r>
-        <w:rPr>
-          <w:spacing w:val="-4"/>
-        </w:rPr>
-        <w:t>de</w:t>
-      </w:r>
-      <w:r>
-        <w:rPr>
-          <w:spacing w:val="-16"/>
-        </w:rPr>
-        <w:t xml:space="preserve"> </w:t>
-      </w:r>
-      <w:r>
-        <w:rPr>
-          <w:spacing w:val="-4"/>
-        </w:rPr>
-        <w:t>recherche</w:t>
-      </w:r>
-      <w:r>
-        <w:rPr>
-          <w:spacing w:val="-10"/>
-        </w:rPr>
-        <w:t xml:space="preserve"> </w:t>
-      </w:r>
-      <w:r>
-        <w:rPr>
-          <w:spacing w:val="-4"/>
-        </w:rPr>
-        <w:t>avec</w:t>
-      </w:r>
-      <w:r>
-        <w:rPr>
-          <w:spacing w:val="-21"/>
-        </w:rPr>
-        <w:t xml:space="preserve"> </w:t>
-      </w:r>
-      <w:r>
-        <w:rPr>
-          <w:spacing w:val="-4"/>
-        </w:rPr>
-        <w:t>les</w:t>
-      </w:r>
-      <w:r>
-        <w:rPr>
-          <w:spacing w:val="-19"/>
-        </w:rPr>
-        <w:t xml:space="preserve"> </w:t>
-      </w:r>
-      <w:r>
-        <w:rPr>
-          <w:spacing w:val="-4"/>
-        </w:rPr>
-        <w:t>liens</w:t>
-      </w:r>
-      <w:r>
-        <w:rPr>
-          <w:spacing w:val="-16"/>
-        </w:rPr>
-        <w:t xml:space="preserve"> </w:t>
-      </w:r>
-      <w:r>
-        <w:rPr>
-          <w:spacing w:val="-10"/>
-        </w:rPr>
-        <w:t>:</w:t>
-      </w:r>
-    </w:p>
-    <w:p>
-      <w:pPr>
-        <w:pStyle w:val="Corpsdetexte"/>
-        <w:spacing w:before="233" w:line="408" w:lineRule="auto"/>
-        <w:ind w:left="141" w:right="1923"/>
-        <w:jc w:val="both"/>
-      </w:pPr>
-      <w:r>
-        <w:rPr>
-          <w:spacing w:val="-6"/>
-        </w:rPr>
-        <w:t>Lien</w:t>
-      </w:r>
-      <w:r>
-        <w:rPr>
-          <w:spacing w:val="-29"/>
-        </w:rPr>
-        <w:t xml:space="preserve"> </w:t>
-      </w:r>
-      <w:r>
-        <w:rPr>
-          <w:spacing w:val="-6"/>
-        </w:rPr>
-        <w:t>menant</w:t>
-      </w:r>
-      <w:r>
-        <w:rPr>
-          <w:spacing w:val="-26"/>
-        </w:rPr>
-        <w:t xml:space="preserve"> </w:t>
-      </w:r>
-      <w:r>
-        <w:rPr>
-          <w:spacing w:val="-6"/>
-        </w:rPr>
-        <w:t>à</w:t>
-      </w:r>
-      <w:r>
-        <w:rPr>
-          <w:spacing w:val="-27"/>
-        </w:rPr>
-        <w:t xml:space="preserve"> </w:t>
-      </w:r>
-      <w:r>
-        <w:rPr>
-          <w:spacing w:val="-6"/>
-        </w:rPr>
-        <w:t>la</w:t>
-      </w:r>
-      <w:r>
-        <w:rPr>
-          <w:spacing w:val="-27"/>
-        </w:rPr>
-        <w:t xml:space="preserve"> </w:t>
-      </w:r>
-      <w:r>
-        <w:rPr>
-          <w:spacing w:val="-6"/>
-        </w:rPr>
-        <w:t>page</w:t>
-      </w:r>
-      <w:r>
-        <w:rPr>
-          <w:spacing w:val="-26"/>
-        </w:rPr>
-        <w:t xml:space="preserve"> </w:t>
-      </w:r>
-      <w:r>
-        <w:rPr>
-          <w:spacing w:val="-6"/>
-        </w:rPr>
-        <w:t>officiel</w:t>
-      </w:r>
-      <w:r>
-        <w:rPr>
-          <w:spacing w:val="-28"/>
-        </w:rPr>
-        <w:t xml:space="preserve"> </w:t>
-      </w:r>
-      <w:r>
-        <w:rPr>
-          <w:spacing w:val="-6"/>
-        </w:rPr>
-        <w:t>de</w:t>
-      </w:r>
-      <w:r>
-        <w:rPr>
-          <w:spacing w:val="-26"/>
-        </w:rPr>
-        <w:t xml:space="preserve"> </w:t>
-      </w:r>
-      <w:r>
-        <w:rPr>
-          <w:spacing w:val="-6"/>
-        </w:rPr>
-        <w:t xml:space="preserve">Vue.js </w:t>
-      </w:r>
-      <w:hyperlink r:id="rId6">
-        <w:r>
-          <w:rPr>
-            <w:color w:val="467885"/>
-            <w:spacing w:val="-10"/>
-            <w:u w:val="single" w:color="467885"/>
-          </w:rPr>
-          <w:t>https://v2.fr.vuejs.org</w:t>
-        </w:r>
-      </w:hyperlink>
-    </w:p>
-    <w:p>
-      <w:pPr>
-        <w:pStyle w:val="Corpsdetexte"/>
-        <w:spacing w:before="3" w:line="295" w:lineRule="auto"/>
-        <w:ind w:left="141"/>
-        <w:jc w:val="both"/>
-      </w:pPr>
-      <w:r>
-        <w:rPr>
-          <w:spacing w:val="-6"/>
-        </w:rPr>
-        <w:t>Lien</w:t>
-      </w:r>
-      <w:r>
-        <w:rPr>
-          <w:spacing w:val="-26"/>
-        </w:rPr>
-        <w:t xml:space="preserve"> </w:t>
-      </w:r>
-      <w:r>
-        <w:rPr>
-          <w:spacing w:val="-6"/>
-        </w:rPr>
-        <w:t>menant</w:t>
-      </w:r>
-      <w:r>
-        <w:rPr>
-          <w:spacing w:val="-26"/>
-        </w:rPr>
-        <w:t xml:space="preserve"> </w:t>
-      </w:r>
-      <w:r>
-        <w:rPr>
-          <w:spacing w:val="-6"/>
-        </w:rPr>
-        <w:t>à</w:t>
-      </w:r>
-      <w:r>
-        <w:rPr>
-          <w:spacing w:val="-27"/>
-        </w:rPr>
-        <w:t xml:space="preserve"> </w:t>
-      </w:r>
-      <w:r>
-        <w:rPr>
-          <w:spacing w:val="-6"/>
-        </w:rPr>
-        <w:t>la</w:t>
-      </w:r>
-      <w:r>
-        <w:rPr>
-          <w:spacing w:val="-27"/>
-        </w:rPr>
-        <w:t xml:space="preserve"> </w:t>
-      </w:r>
-      <w:r>
-        <w:rPr>
-          <w:spacing w:val="-6"/>
-        </w:rPr>
-        <w:t>page</w:t>
-      </w:r>
-      <w:r>
-        <w:rPr>
-          <w:spacing w:val="-23"/>
-        </w:rPr>
-        <w:t xml:space="preserve"> </w:t>
-      </w:r>
-      <w:r>
-        <w:rPr>
-          <w:spacing w:val="-6"/>
-        </w:rPr>
-        <w:t>du</w:t>
-      </w:r>
-      <w:r>
-        <w:rPr>
-          <w:spacing w:val="-29"/>
-        </w:rPr>
-        <w:t xml:space="preserve"> </w:t>
-      </w:r>
-      <w:r>
-        <w:rPr>
-          <w:spacing w:val="-6"/>
-        </w:rPr>
-        <w:t>site</w:t>
-      </w:r>
-      <w:r>
-        <w:rPr>
-          <w:spacing w:val="-26"/>
-        </w:rPr>
-        <w:t xml:space="preserve"> </w:t>
-      </w:r>
-      <w:r>
-        <w:rPr>
-          <w:spacing w:val="-6"/>
-        </w:rPr>
-        <w:t>Vue.js</w:t>
-      </w:r>
-      <w:r>
-        <w:rPr>
-          <w:spacing w:val="-20"/>
-        </w:rPr>
-        <w:t xml:space="preserve"> </w:t>
-      </w:r>
-      <w:r>
-        <w:rPr>
-          <w:spacing w:val="-6"/>
-        </w:rPr>
-        <w:t>comparant</w:t>
-      </w:r>
-      <w:r>
-        <w:rPr>
-          <w:spacing w:val="-24"/>
-        </w:rPr>
-        <w:t xml:space="preserve"> </w:t>
-      </w:r>
-      <w:r>
-        <w:rPr>
-          <w:spacing w:val="-6"/>
-        </w:rPr>
-        <w:t>le</w:t>
-      </w:r>
-      <w:r>
-        <w:rPr>
-          <w:spacing w:val="-26"/>
-        </w:rPr>
-        <w:t xml:space="preserve"> </w:t>
-      </w:r>
-      <w:proofErr w:type="spellStart"/>
-      <w:r>
-        <w:rPr>
-          <w:spacing w:val="-6"/>
-        </w:rPr>
-        <w:t>framework</w:t>
-      </w:r>
-      <w:proofErr w:type="spellEnd"/>
-      <w:r>
-        <w:rPr>
-          <w:spacing w:val="-28"/>
-        </w:rPr>
-        <w:t xml:space="preserve"> </w:t>
-      </w:r>
-      <w:r>
-        <w:rPr>
-          <w:spacing w:val="-6"/>
-        </w:rPr>
-        <w:t>Vue.js</w:t>
-      </w:r>
-      <w:r>
-        <w:rPr>
-          <w:spacing w:val="-28"/>
-        </w:rPr>
-        <w:t xml:space="preserve"> </w:t>
-      </w:r>
-      <w:r>
-        <w:rPr>
-          <w:spacing w:val="-6"/>
-        </w:rPr>
-        <w:t xml:space="preserve">aux </w:t>
-      </w:r>
-      <w:r>
-        <w:t>autres</w:t>
-      </w:r>
-      <w:r>
-        <w:rPr>
-          <w:spacing w:val="-21"/>
-        </w:rPr>
-        <w:t xml:space="preserve"> </w:t>
-      </w:r>
-      <w:proofErr w:type="spellStart"/>
-      <w:r>
-        <w:t>frameworks</w:t>
-      </w:r>
-      <w:proofErr w:type="spellEnd"/>
-      <w:r>
-        <w:rPr>
-          <w:spacing w:val="-16"/>
-        </w:rPr>
-        <w:t xml:space="preserve"> </w:t>
-      </w:r>
-      <w:r>
-        <w:t>JS</w:t>
-      </w:r>
-      <w:r>
-        <w:rPr>
-          <w:spacing w:val="-20"/>
-        </w:rPr>
-        <w:t xml:space="preserve"> </w:t>
-      </w:r>
-      <w:r>
-        <w:t>comme</w:t>
-      </w:r>
-      <w:r>
-        <w:rPr>
-          <w:spacing w:val="-19"/>
-        </w:rPr>
-        <w:t xml:space="preserve"> </w:t>
-      </w:r>
-      <w:proofErr w:type="spellStart"/>
-      <w:r>
-        <w:t>Angular</w:t>
-      </w:r>
-      <w:proofErr w:type="spellEnd"/>
-      <w:r>
-        <w:rPr>
-          <w:spacing w:val="-22"/>
-        </w:rPr>
-        <w:t xml:space="preserve"> </w:t>
-      </w:r>
-      <w:r>
-        <w:t>ou</w:t>
-      </w:r>
-      <w:r>
-        <w:rPr>
-          <w:spacing w:val="-18"/>
-        </w:rPr>
-        <w:t xml:space="preserve"> </w:t>
-      </w:r>
-      <w:proofErr w:type="spellStart"/>
-      <w:r>
-        <w:t>React</w:t>
-      </w:r>
-      <w:proofErr w:type="spellEnd"/>
-    </w:p>
-    <w:p>
-      <w:pPr>
-        <w:spacing w:before="157" w:line="290" w:lineRule="auto"/>
-        <w:ind w:left="141"/>
-        <w:jc w:val="both"/>
-        <w:rPr>
-          <w:sz w:val="32"/>
-        </w:rPr>
-      </w:pPr>
-      <w:hyperlink r:id="rId7" w:anchor="%3A~%3Atext%3DLa%20grande%20différence%20entre%20React%2Creste%20du%20code%20du%20composant">
-        <w:r>
-          <w:rPr>
-            <w:color w:val="467885"/>
-            <w:spacing w:val="-2"/>
-            <w:w w:val="90"/>
-            <w:sz w:val="32"/>
-            <w:u w:val="single" w:color="467885"/>
-          </w:rPr>
-          <w:t>https://v2.fr.vuejs.org/v2/guide/comparison.html#:~:text=La%20gr</w:t>
-        </w:r>
-      </w:hyperlink>
-      <w:r>
-        <w:rPr>
-          <w:color w:val="467885"/>
-          <w:spacing w:val="80"/>
-          <w:sz w:val="32"/>
-        </w:rPr>
-        <w:t xml:space="preserve"> </w:t>
-      </w:r>
-      <w:hyperlink r:id="rId8" w:anchor="%3A~%3Atext%3DLa%20grande%20différence%20entre%20React%2Creste%20du%20code%20du%20composant">
-        <w:r>
-          <w:rPr>
-            <w:color w:val="467885"/>
-            <w:spacing w:val="-2"/>
-            <w:sz w:val="32"/>
-            <w:u w:val="single" w:color="467885"/>
-          </w:rPr>
-          <w:t>ande%20différence%20entre%20React,reste%20du%20code%2</w:t>
-        </w:r>
-      </w:hyperlink>
-      <w:r>
-        <w:rPr>
-          <w:color w:val="467885"/>
-          <w:spacing w:val="80"/>
-          <w:w w:val="150"/>
-          <w:sz w:val="32"/>
-        </w:rPr>
-        <w:t xml:space="preserve"> </w:t>
-      </w:r>
-      <w:hyperlink r:id="rId9" w:anchor="%3A~%3Atext%3DLa%20grande%20différence%20entre%20React%2Creste%20du%20code%20du%20composant">
-        <w:r>
-          <w:rPr>
-            <w:color w:val="467885"/>
-            <w:spacing w:val="-2"/>
-            <w:sz w:val="32"/>
-            <w:u w:val="single" w:color="467885"/>
-          </w:rPr>
-          <w:t>0du%20composant</w:t>
-        </w:r>
-      </w:hyperlink>
-      <w:r>
-        <w:rPr>
-          <w:spacing w:val="-2"/>
-          <w:sz w:val="32"/>
-        </w:rPr>
-        <w:t>.</w:t>
-      </w:r>
-    </w:p>
-    <w:p>
-      <w:pPr>
-        <w:spacing w:line="290" w:lineRule="auto"/>
-        <w:jc w:val="both"/>
-        <w:rPr>
-          <w:sz w:val="32"/>
-        </w:rPr>
-        <w:sectPr>
-          <w:headerReference w:type="default" r:id="rId10"/>
-          <w:footerReference w:type="default" r:id="rId11"/>
-          <w:type w:val="continuous"/>
-          <w:pgSz w:w="11910" w:h="16840"/>
-          <w:pgMar w:top="1320" w:right="1275" w:bottom="1580" w:left="1275" w:header="706" w:footer="1382" w:gutter="0"/>
-          <w:pgNumType w:start="1"/>
-          <w:cols w:space="720"/>
-        </w:sectPr>
-      </w:pPr>
-    </w:p>
-    <w:p>
-      <w:pPr>
-        <w:pStyle w:val="Corpsdetexte"/>
-        <w:spacing w:before="334"/>
-        <w:jc w:val="both"/>
-        <w:rPr>
-          <w:sz w:val="32"/>
-        </w:rPr>
-      </w:pPr>
-    </w:p>
-    <w:p>
-      <w:pPr>
-        <w:spacing w:line="393" w:lineRule="auto"/>
-        <w:ind w:left="141"/>
-        <w:jc w:val="both"/>
-        <w:rPr>
-          <w:sz w:val="32"/>
-        </w:rPr>
-      </w:pPr>
-      <w:r>
-        <w:rPr>
-          <w:sz w:val="32"/>
-        </w:rPr>
-        <w:t>Lien</w:t>
-      </w:r>
-      <w:r>
-        <w:rPr>
-          <w:spacing w:val="-26"/>
-          <w:sz w:val="32"/>
-        </w:rPr>
-        <w:t xml:space="preserve"> </w:t>
-      </w:r>
-      <w:r>
-        <w:rPr>
-          <w:sz w:val="32"/>
-        </w:rPr>
-        <w:t>menant</w:t>
-      </w:r>
-      <w:r>
-        <w:rPr>
-          <w:spacing w:val="-29"/>
-          <w:sz w:val="32"/>
-        </w:rPr>
-        <w:t xml:space="preserve"> </w:t>
-      </w:r>
-      <w:r>
-        <w:rPr>
-          <w:sz w:val="32"/>
-        </w:rPr>
-        <w:t>à</w:t>
-      </w:r>
-      <w:r>
-        <w:rPr>
-          <w:spacing w:val="-29"/>
-          <w:sz w:val="32"/>
-        </w:rPr>
-        <w:t xml:space="preserve"> </w:t>
-      </w:r>
-      <w:r>
-        <w:rPr>
-          <w:sz w:val="32"/>
-        </w:rPr>
-        <w:t>la</w:t>
-      </w:r>
-      <w:r>
-        <w:rPr>
-          <w:spacing w:val="-29"/>
-          <w:sz w:val="32"/>
-        </w:rPr>
-        <w:t xml:space="preserve"> </w:t>
-      </w:r>
-      <w:r>
-        <w:rPr>
-          <w:sz w:val="32"/>
-        </w:rPr>
-        <w:t>page</w:t>
-      </w:r>
-      <w:r>
-        <w:rPr>
-          <w:spacing w:val="-28"/>
-          <w:sz w:val="32"/>
-        </w:rPr>
-        <w:t xml:space="preserve"> </w:t>
-      </w:r>
-      <w:r>
-        <w:rPr>
-          <w:sz w:val="32"/>
-        </w:rPr>
-        <w:t>officiel</w:t>
-      </w:r>
-      <w:r>
-        <w:rPr>
-          <w:spacing w:val="-33"/>
-          <w:sz w:val="32"/>
-        </w:rPr>
-        <w:t xml:space="preserve"> </w:t>
-      </w:r>
-      <w:r>
-        <w:rPr>
-          <w:sz w:val="32"/>
-        </w:rPr>
-        <w:t>de</w:t>
-      </w:r>
-      <w:r>
-        <w:rPr>
-          <w:spacing w:val="-32"/>
-          <w:sz w:val="32"/>
-        </w:rPr>
-        <w:t xml:space="preserve"> </w:t>
-      </w:r>
-      <w:r>
-        <w:rPr>
-          <w:sz w:val="32"/>
-        </w:rPr>
-        <w:t xml:space="preserve">Flask </w:t>
-      </w:r>
-      <w:hyperlink r:id="rId12">
-        <w:r>
-          <w:rPr>
-            <w:color w:val="467885"/>
-            <w:spacing w:val="-2"/>
-            <w:w w:val="90"/>
-            <w:sz w:val="32"/>
-            <w:u w:val="single" w:color="467885"/>
-          </w:rPr>
-          <w:t>https://flask.palletsprojects.com/en/stable</w:t>
-        </w:r>
-      </w:hyperlink>
-    </w:p>
-    <w:p>
-      <w:pPr>
-        <w:pStyle w:val="Corpsdetexte"/>
-        <w:spacing w:before="248"/>
-        <w:jc w:val="both"/>
-        <w:rPr>
-          <w:sz w:val="32"/>
-        </w:rPr>
-      </w:pPr>
+          <w:spacing w:val="-10"/>
+          <w:sz w:val="28"/>
+          <w:szCs w:val="28"/>
+          <w:u w:val="none"/>
+        </w:rPr>
+      </w:pPr>
+      <w:r>
+        <w:rPr>
+          <w:spacing w:val="-10"/>
+          <w:sz w:val="28"/>
+          <w:szCs w:val="28"/>
+          <w:u w:val="none"/>
+        </w:rPr>
+        <w:t>Historique des langages de programmation web :</w:t>
+      </w:r>
     </w:p>
     <w:p>
       <w:pPr>
@@ -1503,72 +213,11 @@
         <w:jc w:val="both"/>
         <w:rPr>
           <w:spacing w:val="-10"/>
-          <w:u w:val="none"/>
-        </w:rPr>
-      </w:pPr>
-      <w:r>
-        <w:rPr>
-          <w:spacing w:val="-2"/>
-          <w:u w:val="none"/>
-        </w:rPr>
-        <w:t>Résultats</w:t>
-      </w:r>
-      <w:r>
-        <w:rPr>
-          <w:spacing w:val="-28"/>
-          <w:u w:val="none"/>
-        </w:rPr>
-        <w:t xml:space="preserve"> </w:t>
-      </w:r>
-      <w:r>
-        <w:rPr>
-          <w:spacing w:val="-2"/>
-          <w:u w:val="none"/>
-        </w:rPr>
-        <w:t>de</w:t>
-      </w:r>
-      <w:r>
-        <w:rPr>
-          <w:spacing w:val="-24"/>
-          <w:u w:val="none"/>
-        </w:rPr>
-        <w:t xml:space="preserve"> </w:t>
-      </w:r>
-      <w:r>
-        <w:rPr>
-          <w:spacing w:val="-2"/>
-          <w:u w:val="none"/>
-        </w:rPr>
-        <w:t>mes</w:t>
-      </w:r>
-      <w:r>
-        <w:rPr>
-          <w:spacing w:val="-28"/>
-          <w:u w:val="none"/>
-        </w:rPr>
-        <w:t xml:space="preserve"> </w:t>
-      </w:r>
-      <w:r>
-        <w:rPr>
-          <w:spacing w:val="-2"/>
-          <w:u w:val="none"/>
-        </w:rPr>
-        <w:t>recherches</w:t>
-      </w:r>
-      <w:r>
-        <w:rPr>
-          <w:spacing w:val="-22"/>
-          <w:u w:val="none"/>
-        </w:rPr>
-        <w:t xml:space="preserve"> </w:t>
-      </w:r>
-      <w:r>
-        <w:rPr>
-          <w:spacing w:val="-10"/>
-          <w:u w:val="none"/>
-        </w:rPr>
-        <w:t>:</w:t>
-      </w:r>
+          <w:sz w:val="28"/>
+          <w:szCs w:val="28"/>
+          <w:u w:val="none"/>
+        </w:rPr>
+      </w:pPr>
     </w:p>
     <w:p>
       <w:pPr>
@@ -1576,10 +225,47 @@
         <w:spacing w:before="1"/>
         <w:jc w:val="both"/>
         <w:rPr>
-          <w:spacing w:val="-10"/>
-          <w:u w:val="none"/>
-        </w:rPr>
-      </w:pPr>
+          <w:i/>
+          <w:iCs/>
+          <w:spacing w:val="-10"/>
+          <w:sz w:val="28"/>
+          <w:szCs w:val="28"/>
+          <w:u w:val="none"/>
+        </w:rPr>
+      </w:pPr>
+      <w:r>
+        <w:rPr>
+          <w:i/>
+          <w:iCs/>
+          <w:spacing w:val="-10"/>
+          <w:sz w:val="28"/>
+          <w:szCs w:val="28"/>
+          <w:u w:val="none"/>
+        </w:rPr>
+        <w:t>(</w:t>
+      </w:r>
+      <w:r>
+        <w:rPr>
+          <w:i/>
+          <w:iCs/>
+          <w:spacing w:val="-10"/>
+          <w:sz w:val="28"/>
+          <w:szCs w:val="28"/>
+          <w:u w:val="none"/>
+        </w:rPr>
+        <w:t>Choix : Python, Vue.js et Flutter</w:t>
+      </w:r>
+      <w:r>
+        <w:rPr>
+          <w:i/>
+          <w:iCs/>
+          <w:spacing w:val="-10"/>
+          <w:sz w:val="28"/>
+          <w:szCs w:val="28"/>
+          <w:u w:val="none"/>
+        </w:rPr>
+        <w:t>)</w:t>
+      </w:r>
     </w:p>
     <w:p>
       <w:pPr>
@@ -1593,15 +279,6 @@
           <w:u w:val="none"/>
         </w:rPr>
       </w:pPr>
-      <w:r>
-        <w:rPr>
-          <w:spacing w:val="-10"/>
-          <w:sz w:val="28"/>
-          <w:szCs w:val="28"/>
-          <w:u w:val="none"/>
-        </w:rPr>
-        <w:t>Historique des langages de programmation web :</w:t>
-      </w:r>
     </w:p>
     <w:p>
       <w:pPr>
@@ -1609,12 +286,23 @@
         <w:spacing w:before="1"/>
         <w:jc w:val="both"/>
         <w:rPr>
+          <w:color w:val="EE0000"/>
           <w:spacing w:val="-10"/>
           <w:sz w:val="28"/>
           <w:szCs w:val="28"/>
           <w:u w:val="none"/>
         </w:rPr>
       </w:pPr>
+      <w:r>
+        <w:rPr>
+          <w:color w:val="EE0000"/>
+          <w:spacing w:val="-10"/>
+          <w:sz w:val="28"/>
+          <w:szCs w:val="28"/>
+          <w:u w:val="none"/>
+        </w:rPr>
+        <w:t>Début du Web : HTML, CSS, JS (Année 90)</w:t>
+      </w:r>
     </w:p>
     <w:p>
       <w:pPr>
@@ -1623,38 +311,9 @@
         <w:jc w:val="both"/>
         <w:rPr>
           <w:spacing w:val="-10"/>
-          <w:sz w:val="28"/>
-          <w:szCs w:val="28"/>
-          <w:u w:val="none"/>
-        </w:rPr>
-      </w:pPr>
-      <w:r>
-        <w:rPr>
-          <w:spacing w:val="-10"/>
-          <w:sz w:val="28"/>
-          <w:szCs w:val="28"/>
-          <w:u w:val="none"/>
-        </w:rPr>
-        <w:t>Début du Web</w:t>
-      </w:r>
-      <w:r>
-        <w:rPr>
-          <w:spacing w:val="-10"/>
-          <w:sz w:val="28"/>
-          <w:szCs w:val="28"/>
-          <w:u w:val="none"/>
-        </w:rPr>
-        <w:t> : HTML, CSS, JS</w:t>
-      </w:r>
-      <w:r>
-        <w:rPr>
-          <w:spacing w:val="-10"/>
-          <w:sz w:val="28"/>
-          <w:szCs w:val="28"/>
-          <w:u w:val="none"/>
-        </w:rPr>
-        <w:t xml:space="preserve"> (Année 90)</w:t>
-      </w:r>
+          <w:u w:val="none"/>
+        </w:rPr>
+      </w:pPr>
     </w:p>
     <w:p>
       <w:pPr>
@@ -1663,9 +322,87 @@
         <w:jc w:val="both"/>
         <w:rPr>
           <w:spacing w:val="-10"/>
-          <w:u w:val="none"/>
-        </w:rPr>
-      </w:pPr>
+          <w:sz w:val="24"/>
+          <w:szCs w:val="24"/>
+          <w:u w:val="none"/>
+        </w:rPr>
+      </w:pPr>
+      <w:r>
+        <w:rPr>
+          <w:spacing w:val="-10"/>
+          <w:sz w:val="24"/>
+          <w:szCs w:val="24"/>
+          <w:u w:val="none"/>
+        </w:rPr>
+        <w:t xml:space="preserve">Le langage HTML </w:t>
+      </w:r>
+      <w:r>
+        <w:rPr>
+          <w:spacing w:val="-10"/>
+          <w:sz w:val="24"/>
+          <w:szCs w:val="24"/>
+          <w:u w:val="none"/>
+        </w:rPr>
+        <w:t xml:space="preserve">ou </w:t>
+      </w:r>
+      <w:r>
+        <w:rPr>
+          <w:spacing w:val="-10"/>
+          <w:sz w:val="24"/>
+          <w:szCs w:val="24"/>
+          <w:u w:val="none"/>
+        </w:rPr>
+        <w:t xml:space="preserve">HyperText Markup </w:t>
+      </w:r>
+      <w:proofErr w:type="spellStart"/>
+      <w:r>
+        <w:rPr>
+          <w:spacing w:val="-10"/>
+          <w:sz w:val="24"/>
+          <w:szCs w:val="24"/>
+          <w:u w:val="none"/>
+        </w:rPr>
+        <w:t>Language</w:t>
+      </w:r>
+      <w:proofErr w:type="spellEnd"/>
+      <w:r>
+        <w:rPr>
+          <w:spacing w:val="-10"/>
+          <w:sz w:val="24"/>
+          <w:szCs w:val="24"/>
+          <w:u w:val="none"/>
+        </w:rPr>
+        <w:t xml:space="preserve"> </w:t>
+      </w:r>
+      <w:r>
+        <w:rPr>
+          <w:spacing w:val="-10"/>
+          <w:sz w:val="24"/>
+          <w:szCs w:val="24"/>
+          <w:u w:val="none"/>
+        </w:rPr>
+        <w:t>sert à écrire le corps du texte</w:t>
+      </w:r>
+      <w:r>
+        <w:rPr>
+          <w:spacing w:val="-10"/>
+          <w:sz w:val="24"/>
+          <w:szCs w:val="24"/>
+          <w:u w:val="none"/>
+        </w:rPr>
+        <w:t>, c’est un langage à balises, donc qui utilise des balises pour coder exemple pour écrire un simple texte on utilisera &lt;p</w:t>
+      </w:r>
+      <w:proofErr w:type="gramStart"/>
+      <w:r>
+        <w:rPr>
+          <w:spacing w:val="-10"/>
+          <w:sz w:val="24"/>
+          <w:szCs w:val="24"/>
+          <w:u w:val="none"/>
+        </w:rPr>
+        <w:t>&gt; .</w:t>
+      </w:r>
+      <w:proofErr w:type="gramEnd"/>
     </w:p>
     <w:p>
       <w:pPr>
@@ -1679,35 +416,6 @@
           <w:u w:val="none"/>
         </w:rPr>
       </w:pPr>
-      <w:r>
-        <w:rPr>
-          <w:spacing w:val="-10"/>
-          <w:sz w:val="24"/>
-          <w:szCs w:val="24"/>
-          <w:u w:val="none"/>
-        </w:rPr>
-        <w:t xml:space="preserve">Le langage HTML sert à écrire le corps du texte, le langage CSS permet de confectionner l’interface pour qu’elle soit plus vivante avec des couleurs, des styles de page </w:t>
-      </w:r>
-      <w:proofErr w:type="spellStart"/>
-      <w:r>
-        <w:rPr>
-          <w:spacing w:val="-10"/>
-          <w:sz w:val="24"/>
-          <w:szCs w:val="24"/>
-          <w:u w:val="none"/>
-        </w:rPr>
-        <w:t>etc</w:t>
-      </w:r>
-      <w:proofErr w:type="spellEnd"/>
-      <w:r>
-        <w:rPr>
-          <w:spacing w:val="-10"/>
-          <w:sz w:val="24"/>
-          <w:szCs w:val="24"/>
-          <w:u w:val="none"/>
-        </w:rPr>
-        <w:t xml:space="preserve"> …</w:t>
-      </w:r>
     </w:p>
     <w:p>
       <w:pPr>
@@ -1721,15 +429,6 @@
           <w:u w:val="none"/>
         </w:rPr>
       </w:pPr>
-      <w:r>
-        <w:rPr>
-          <w:spacing w:val="-10"/>
-          <w:sz w:val="24"/>
-          <w:szCs w:val="24"/>
-          <w:u w:val="none"/>
-        </w:rPr>
-        <w:t>Le JS sert à donner un effet dynamique à la page via des animations ou des évènements</w:t>
-      </w:r>
     </w:p>
     <w:p>
       <w:pPr>
@@ -1743,6 +442,82 @@
           <w:u w:val="none"/>
         </w:rPr>
       </w:pPr>
+      <w:r>
+        <w:rPr>
+          <w:spacing w:val="-10"/>
+          <w:sz w:val="24"/>
+          <w:szCs w:val="24"/>
+          <w:u w:val="none"/>
+        </w:rPr>
+        <w:t>L</w:t>
+      </w:r>
+      <w:r>
+        <w:rPr>
+          <w:spacing w:val="-10"/>
+          <w:sz w:val="24"/>
+          <w:szCs w:val="24"/>
+          <w:u w:val="none"/>
+        </w:rPr>
+        <w:t xml:space="preserve">e langage CSS </w:t>
+      </w:r>
+      <w:r>
+        <w:rPr>
+          <w:spacing w:val="-10"/>
+          <w:sz w:val="24"/>
+          <w:szCs w:val="24"/>
+          <w:u w:val="none"/>
+        </w:rPr>
+        <w:t xml:space="preserve">ou </w:t>
+      </w:r>
+      <w:proofErr w:type="spellStart"/>
+      <w:r>
+        <w:rPr>
+          <w:spacing w:val="-10"/>
+          <w:sz w:val="24"/>
+          <w:szCs w:val="24"/>
+          <w:u w:val="none"/>
+        </w:rPr>
+        <w:t>Cascading</w:t>
+      </w:r>
+      <w:proofErr w:type="spellEnd"/>
+      <w:r>
+        <w:rPr>
+          <w:spacing w:val="-10"/>
+          <w:sz w:val="24"/>
+          <w:szCs w:val="24"/>
+          <w:u w:val="none"/>
+        </w:rPr>
+        <w:t xml:space="preserve"> Style Sheets </w:t>
+      </w:r>
+      <w:r>
+        <w:rPr>
+          <w:spacing w:val="-10"/>
+          <w:sz w:val="24"/>
+          <w:szCs w:val="24"/>
+          <w:u w:val="none"/>
+        </w:rPr>
+        <w:t xml:space="preserve">permet de confectionner l’interface pour qu’elle soit plus vivante avec des couleurs, des styles de page </w:t>
+      </w:r>
+      <w:proofErr w:type="spellStart"/>
+      <w:r>
+        <w:rPr>
+          <w:spacing w:val="-10"/>
+          <w:sz w:val="24"/>
+          <w:szCs w:val="24"/>
+          <w:u w:val="none"/>
+        </w:rPr>
+        <w:t>etc</w:t>
+      </w:r>
+      <w:proofErr w:type="spellEnd"/>
+      <w:r>
+        <w:rPr>
+          <w:spacing w:val="-10"/>
+          <w:sz w:val="24"/>
+          <w:szCs w:val="24"/>
+          <w:u w:val="none"/>
+        </w:rPr>
+        <w:t xml:space="preserve"> …</w:t>
+      </w:r>
     </w:p>
     <w:p>
       <w:pPr>
@@ -1764,47 +539,11 @@
         <w:jc w:val="both"/>
         <w:rPr>
           <w:spacing w:val="-10"/>
-          <w:sz w:val="28"/>
-          <w:szCs w:val="28"/>
-          <w:u w:val="none"/>
-        </w:rPr>
-      </w:pPr>
-      <w:r>
-        <w:rPr>
-          <w:spacing w:val="-10"/>
-          <w:sz w:val="28"/>
-          <w:szCs w:val="28"/>
-          <w:u w:val="none"/>
-        </w:rPr>
-        <w:t>La possibilité de stocker des données</w:t>
-      </w:r>
-      <w:r>
-        <w:rPr>
-          <w:spacing w:val="-10"/>
-          <w:sz w:val="28"/>
-          <w:szCs w:val="28"/>
-          <w:u w:val="none"/>
-        </w:rPr>
-        <w:t xml:space="preserve"> </w:t>
-      </w:r>
-      <w:r>
-        <w:rPr>
-          <w:spacing w:val="-10"/>
-          <w:sz w:val="28"/>
-          <w:szCs w:val="28"/>
-          <w:u w:val="none"/>
-        </w:rPr>
-        <w:t>avec le</w:t>
-      </w:r>
-      <w:r>
-        <w:rPr>
-          <w:spacing w:val="-10"/>
-          <w:sz w:val="28"/>
-          <w:szCs w:val="28"/>
-          <w:u w:val="none"/>
-        </w:rPr>
-        <w:t xml:space="preserve"> PHP :</w:t>
-      </w:r>
+          <w:sz w:val="24"/>
+          <w:szCs w:val="24"/>
+          <w:u w:val="none"/>
+        </w:rPr>
+      </w:pPr>
     </w:p>
     <w:p>
       <w:pPr>
@@ -1825,25 +564,25 @@
           <w:szCs w:val="24"/>
           <w:u w:val="none"/>
         </w:rPr>
-        <w:t>Avec le PHP, on peut désormais faire un site web, avec la possibilité de stocker des données et de les exploiter ce qu’on ne pouvait pas faire avant</w:t>
-      </w:r>
-      <w:r>
-        <w:rPr>
-          <w:spacing w:val="-10"/>
-          <w:sz w:val="24"/>
-          <w:szCs w:val="24"/>
-          <w:u w:val="none"/>
-        </w:rPr>
-        <w:t>, les données étaient stockées sur le moment puis disparaissaient</w:t>
-      </w:r>
-      <w:r>
-        <w:rPr>
-          <w:spacing w:val="-10"/>
-          <w:sz w:val="24"/>
-          <w:szCs w:val="24"/>
-          <w:u w:val="none"/>
-        </w:rPr>
-        <w:t>.</w:t>
+        <w:t xml:space="preserve">Le JS </w:t>
+      </w:r>
+      <w:r>
+        <w:rPr>
+          <w:spacing w:val="-10"/>
+          <w:sz w:val="24"/>
+          <w:szCs w:val="24"/>
+          <w:u w:val="none"/>
+        </w:rPr>
+        <w:t xml:space="preserve">ou JavaScript </w:t>
+      </w:r>
+      <w:r>
+        <w:rPr>
+          <w:spacing w:val="-10"/>
+          <w:sz w:val="24"/>
+          <w:szCs w:val="24"/>
+          <w:u w:val="none"/>
+        </w:rPr>
+        <w:t>sert à donner un effet dynamique à la page via des animations ou des évènements</w:t>
       </w:r>
     </w:p>
     <w:p>
@@ -1865,6 +604,7 @@
         <w:spacing w:before="1"/>
         <w:jc w:val="both"/>
         <w:rPr>
+          <w:color w:val="EE0000"/>
           <w:spacing w:val="-10"/>
           <w:sz w:val="28"/>
           <w:szCs w:val="28"/>
@@ -1873,32 +613,43 @@
       </w:pPr>
       <w:r>
         <w:rPr>
+          <w:color w:val="EE0000"/>
           <w:spacing w:val="-10"/>
           <w:sz w:val="28"/>
           <w:szCs w:val="28"/>
           <w:u w:val="none"/>
         </w:rPr>
-        <w:t xml:space="preserve">L’arrivée des </w:t>
-      </w:r>
-      <w:proofErr w:type="spellStart"/>
-      <w:r>
-        <w:rPr>
+        <w:t>La possibilité de stocker des données</w:t>
+      </w:r>
+      <w:r>
+        <w:rPr>
+          <w:color w:val="EE0000"/>
           <w:spacing w:val="-10"/>
           <w:sz w:val="28"/>
           <w:szCs w:val="28"/>
           <w:u w:val="none"/>
         </w:rPr>
-        <w:t>Frameworks</w:t>
-      </w:r>
-      <w:proofErr w:type="spellEnd"/>
-      <w:r>
-        <w:rPr>
+        <w:t xml:space="preserve"> </w:t>
+      </w:r>
+      <w:r>
+        <w:rPr>
+          <w:color w:val="EE0000"/>
           <w:spacing w:val="-10"/>
           <w:sz w:val="28"/>
           <w:szCs w:val="28"/>
           <w:u w:val="none"/>
         </w:rPr>
-        <w:t> :</w:t>
+        <w:t>avec le</w:t>
+      </w:r>
+      <w:r>
+        <w:rPr>
+          <w:color w:val="EE0000"/>
+          <w:spacing w:val="-10"/>
+          <w:sz w:val="28"/>
+          <w:szCs w:val="28"/>
+          <w:u w:val="none"/>
+        </w:rPr>
+        <w:t xml:space="preserve"> PHP :</w:t>
       </w:r>
     </w:p>
     <w:p>
@@ -1908,40 +659,11 @@
         <w:jc w:val="both"/>
         <w:rPr>
           <w:spacing w:val="-10"/>
-          <w:sz w:val="24"/>
-          <w:szCs w:val="24"/>
-          <w:u w:val="none"/>
-        </w:rPr>
-      </w:pPr>
-      <w:r>
-        <w:rPr>
-          <w:spacing w:val="-10"/>
-          <w:sz w:val="24"/>
-          <w:szCs w:val="24"/>
-          <w:u w:val="none"/>
-        </w:rPr>
-        <w:t xml:space="preserve">Un </w:t>
-      </w:r>
-      <w:proofErr w:type="spellStart"/>
-      <w:r>
-        <w:rPr>
-          <w:spacing w:val="-10"/>
-          <w:sz w:val="24"/>
-          <w:szCs w:val="24"/>
-          <w:u w:val="none"/>
-        </w:rPr>
-        <w:t>framework</w:t>
-      </w:r>
-      <w:proofErr w:type="spellEnd"/>
-      <w:r>
-        <w:rPr>
-          <w:spacing w:val="-10"/>
-          <w:sz w:val="24"/>
-          <w:szCs w:val="24"/>
-          <w:u w:val="none"/>
-        </w:rPr>
-        <w:t xml:space="preserve"> est simplement une boîte à outil informatique permettant au développeur de pouvoir utiliser des composants autonomes permettant de coder plus simplement et de manière différente un site ou une application</w:t>
-      </w:r>
+          <w:sz w:val="28"/>
+          <w:szCs w:val="28"/>
+          <w:u w:val="none"/>
+        </w:rPr>
+      </w:pPr>
     </w:p>
     <w:p>
       <w:pPr>
@@ -1955,6 +677,33 @@
           <w:u w:val="none"/>
         </w:rPr>
       </w:pPr>
+      <w:r>
+        <w:rPr>
+          <w:spacing w:val="-10"/>
+          <w:sz w:val="24"/>
+          <w:szCs w:val="24"/>
+          <w:u w:val="none"/>
+        </w:rPr>
+        <w:t>Avec le PHP, on peut désormais faire un site web, avec la possibilité de stocker des données et de les exploiter ce qu’on ne pouvait pas faire avant</w:t>
+      </w:r>
+      <w:r>
+        <w:rPr>
+          <w:spacing w:val="-10"/>
+          <w:sz w:val="24"/>
+          <w:szCs w:val="24"/>
+          <w:u w:val="none"/>
+        </w:rPr>
+        <w:t>, les données étaient stockées sur le moment puis disparaissaient</w:t>
+      </w:r>
+      <w:r>
+        <w:rPr>
+          <w:spacing w:val="-10"/>
+          <w:sz w:val="24"/>
+          <w:szCs w:val="24"/>
+          <w:u w:val="none"/>
+        </w:rPr>
+        <w:t>.</w:t>
+      </w:r>
     </w:p>
     <w:p>
       <w:pPr>
@@ -1968,106 +717,6 @@
           <w:u w:val="none"/>
         </w:rPr>
       </w:pPr>
-      <w:r>
-        <w:rPr>
-          <w:spacing w:val="-10"/>
-          <w:sz w:val="24"/>
-          <w:szCs w:val="24"/>
-          <w:u w:val="none"/>
-        </w:rPr>
-        <w:t xml:space="preserve">Par exemple : Symfony est une </w:t>
-      </w:r>
-      <w:proofErr w:type="spellStart"/>
-      <w:r>
-        <w:rPr>
-          <w:spacing w:val="-10"/>
-          <w:sz w:val="24"/>
-          <w:szCs w:val="24"/>
-          <w:u w:val="none"/>
-        </w:rPr>
-        <w:t>framework</w:t>
-      </w:r>
-      <w:proofErr w:type="spellEnd"/>
-      <w:r>
-        <w:rPr>
-          <w:spacing w:val="-10"/>
-          <w:sz w:val="24"/>
-          <w:szCs w:val="24"/>
-          <w:u w:val="none"/>
-        </w:rPr>
-        <w:t xml:space="preserve"> PHP, mais qui à la différence du PHP permet d’apporter des composants et une manière de coder drastiquement différentes via l’ajout de </w:t>
-      </w:r>
-      <w:proofErr w:type="spellStart"/>
-      <w:r>
-        <w:rPr>
-          <w:spacing w:val="-10"/>
-          <w:sz w:val="24"/>
-          <w:szCs w:val="24"/>
-          <w:u w:val="none"/>
-        </w:rPr>
-        <w:t>controller</w:t>
-      </w:r>
-      <w:proofErr w:type="spellEnd"/>
-      <w:r>
-        <w:rPr>
-          <w:spacing w:val="-10"/>
-          <w:sz w:val="24"/>
-          <w:szCs w:val="24"/>
-          <w:u w:val="none"/>
-        </w:rPr>
-        <w:t xml:space="preserve">, </w:t>
-      </w:r>
-      <w:proofErr w:type="gramStart"/>
-      <w:r>
-        <w:rPr>
-          <w:spacing w:val="-10"/>
-          <w:sz w:val="24"/>
-          <w:szCs w:val="24"/>
-          <w:u w:val="none"/>
-        </w:rPr>
-        <w:t>doctrine ,</w:t>
-      </w:r>
-      <w:proofErr w:type="gramEnd"/>
-      <w:r>
-        <w:rPr>
-          <w:spacing w:val="-10"/>
-          <w:sz w:val="24"/>
-          <w:szCs w:val="24"/>
-          <w:u w:val="none"/>
-        </w:rPr>
-        <w:t xml:space="preserve"> </w:t>
-      </w:r>
-      <w:proofErr w:type="spellStart"/>
-      <w:r>
-        <w:rPr>
-          <w:spacing w:val="-10"/>
-          <w:sz w:val="24"/>
-          <w:szCs w:val="24"/>
-          <w:u w:val="none"/>
-        </w:rPr>
-        <w:t>etc</w:t>
-      </w:r>
-      <w:proofErr w:type="spellEnd"/>
-      <w:proofErr w:type="gramStart"/>
-      <w:r>
-        <w:rPr>
-          <w:spacing w:val="-10"/>
-          <w:sz w:val="24"/>
-          <w:szCs w:val="24"/>
-          <w:u w:val="none"/>
-        </w:rPr>
-        <w:t xml:space="preserve"> ….</w:t>
-      </w:r>
-      <w:proofErr w:type="gramEnd"/>
-      <w:r>
-        <w:rPr>
-          <w:spacing w:val="-10"/>
-          <w:sz w:val="24"/>
-          <w:szCs w:val="24"/>
-          <w:u w:val="none"/>
-        </w:rPr>
-        <w:t>.</w:t>
-      </w:r>
     </w:p>
     <w:p>
       <w:pPr>
@@ -2075,12 +724,45 @@
         <w:spacing w:before="1"/>
         <w:jc w:val="both"/>
         <w:rPr>
-          <w:spacing w:val="-10"/>
-          <w:sz w:val="24"/>
-          <w:szCs w:val="24"/>
-          <w:u w:val="none"/>
-        </w:rPr>
-      </w:pPr>
+          <w:color w:val="EE0000"/>
+          <w:spacing w:val="-10"/>
+          <w:sz w:val="28"/>
+          <w:szCs w:val="28"/>
+          <w:u w:val="none"/>
+        </w:rPr>
+      </w:pPr>
+      <w:r>
+        <w:rPr>
+          <w:color w:val="EE0000"/>
+          <w:spacing w:val="-10"/>
+          <w:sz w:val="28"/>
+          <w:szCs w:val="28"/>
+          <w:u w:val="none"/>
+        </w:rPr>
+        <w:t xml:space="preserve">L’arrivée des </w:t>
+      </w:r>
+      <w:proofErr w:type="spellStart"/>
+      <w:r>
+        <w:rPr>
+          <w:color w:val="EE0000"/>
+          <w:spacing w:val="-10"/>
+          <w:sz w:val="28"/>
+          <w:szCs w:val="28"/>
+          <w:u w:val="none"/>
+        </w:rPr>
+        <w:t>Frameworks</w:t>
+      </w:r>
+      <w:proofErr w:type="spellEnd"/>
+      <w:r>
+        <w:rPr>
+          <w:color w:val="EE0000"/>
+          <w:spacing w:val="-10"/>
+          <w:sz w:val="28"/>
+          <w:szCs w:val="28"/>
+          <w:u w:val="none"/>
+        </w:rPr>
+        <w:t> :</w:t>
+      </w:r>
     </w:p>
     <w:p>
       <w:pPr>
@@ -2088,50 +770,13 @@
         <w:spacing w:before="1"/>
         <w:jc w:val="both"/>
         <w:rPr>
-          <w:spacing w:val="-10"/>
-          <w:sz w:val="24"/>
-          <w:szCs w:val="24"/>
-          <w:u w:val="none"/>
-        </w:rPr>
-      </w:pPr>
-      <w:r>
-        <w:rPr>
-          <w:spacing w:val="-10"/>
-          <w:sz w:val="24"/>
-          <w:szCs w:val="24"/>
-          <w:u w:val="none"/>
-        </w:rPr>
-        <w:t xml:space="preserve">Dans le monde du Web, plusieurs </w:t>
-      </w:r>
-      <w:proofErr w:type="spellStart"/>
-      <w:r>
-        <w:rPr>
-          <w:spacing w:val="-10"/>
-          <w:sz w:val="24"/>
-          <w:szCs w:val="24"/>
-          <w:u w:val="none"/>
-        </w:rPr>
-        <w:t>frameworks</w:t>
-      </w:r>
-      <w:proofErr w:type="spellEnd"/>
-      <w:r>
-        <w:rPr>
-          <w:spacing w:val="-10"/>
-          <w:sz w:val="24"/>
-          <w:szCs w:val="24"/>
-          <w:u w:val="none"/>
-        </w:rPr>
-        <w:t xml:space="preserve"> sont utilisés pour plusieurs usages </w:t>
-      </w:r>
-      <w:r>
-        <w:rPr>
-          <w:spacing w:val="-10"/>
-          <w:sz w:val="24"/>
-          <w:szCs w:val="24"/>
-          <w:u w:val="none"/>
-        </w:rPr>
-        <w:t>et via plusieurs langages qui ne sont pas forcément du web :</w:t>
-      </w:r>
+          <w:color w:val="EE0000"/>
+          <w:spacing w:val="-10"/>
+          <w:sz w:val="28"/>
+          <w:szCs w:val="28"/>
+          <w:u w:val="none"/>
+        </w:rPr>
+      </w:pPr>
     </w:p>
     <w:p>
       <w:pPr>
@@ -2145,6 +790,35 @@
           <w:u w:val="none"/>
         </w:rPr>
       </w:pPr>
+      <w:r>
+        <w:rPr>
+          <w:spacing w:val="-10"/>
+          <w:sz w:val="24"/>
+          <w:szCs w:val="24"/>
+          <w:u w:val="none"/>
+        </w:rPr>
+        <w:t xml:space="preserve">Un </w:t>
+      </w:r>
+      <w:proofErr w:type="spellStart"/>
+      <w:r>
+        <w:rPr>
+          <w:spacing w:val="-10"/>
+          <w:sz w:val="24"/>
+          <w:szCs w:val="24"/>
+          <w:u w:val="none"/>
+        </w:rPr>
+        <w:t>framework</w:t>
+      </w:r>
+      <w:proofErr w:type="spellEnd"/>
+      <w:r>
+        <w:rPr>
+          <w:spacing w:val="-10"/>
+          <w:sz w:val="24"/>
+          <w:szCs w:val="24"/>
+          <w:u w:val="none"/>
+        </w:rPr>
+        <w:t xml:space="preserve"> est simplement une boîte à outil informatique permettant au développeur de pouvoir utiliser des composants autonomes permettant de coder plus simplement et de manière différente un site ou une application</w:t>
+      </w:r>
     </w:p>
     <w:p>
       <w:pPr>
@@ -2178,8 +852,227 @@
           <w:szCs w:val="24"/>
           <w:u w:val="none"/>
         </w:rPr>
+        <w:t xml:space="preserve">Par exemple : Symfony est une </w:t>
+      </w:r>
+      <w:proofErr w:type="spellStart"/>
+      <w:r>
+        <w:rPr>
+          <w:spacing w:val="-10"/>
+          <w:sz w:val="24"/>
+          <w:szCs w:val="24"/>
+          <w:u w:val="none"/>
+        </w:rPr>
+        <w:t>framework</w:t>
+      </w:r>
+      <w:proofErr w:type="spellEnd"/>
+      <w:r>
+        <w:rPr>
+          <w:spacing w:val="-10"/>
+          <w:sz w:val="24"/>
+          <w:szCs w:val="24"/>
+          <w:u w:val="none"/>
+        </w:rPr>
+        <w:t xml:space="preserve"> PHP, mais qui à la différence du PHP permet d’apporter des composants et une manière de coder drastiquement différentes via l’ajout de </w:t>
+      </w:r>
+      <w:proofErr w:type="spellStart"/>
+      <w:r>
+        <w:rPr>
+          <w:spacing w:val="-10"/>
+          <w:sz w:val="24"/>
+          <w:szCs w:val="24"/>
+          <w:u w:val="none"/>
+        </w:rPr>
+        <w:t>controller</w:t>
+      </w:r>
+      <w:proofErr w:type="spellEnd"/>
+      <w:r>
+        <w:rPr>
+          <w:spacing w:val="-10"/>
+          <w:sz w:val="24"/>
+          <w:szCs w:val="24"/>
+          <w:u w:val="none"/>
+        </w:rPr>
+        <w:t xml:space="preserve">, </w:t>
+      </w:r>
+      <w:proofErr w:type="gramStart"/>
+      <w:r>
+        <w:rPr>
+          <w:spacing w:val="-10"/>
+          <w:sz w:val="24"/>
+          <w:szCs w:val="24"/>
+          <w:u w:val="none"/>
+        </w:rPr>
+        <w:t>doctrine ,</w:t>
+      </w:r>
+      <w:proofErr w:type="gramEnd"/>
+      <w:r>
+        <w:rPr>
+          <w:spacing w:val="-10"/>
+          <w:sz w:val="24"/>
+          <w:szCs w:val="24"/>
+          <w:u w:val="none"/>
+        </w:rPr>
+        <w:t xml:space="preserve"> </w:t>
+      </w:r>
+      <w:proofErr w:type="spellStart"/>
+      <w:r>
+        <w:rPr>
+          <w:spacing w:val="-10"/>
+          <w:sz w:val="24"/>
+          <w:szCs w:val="24"/>
+          <w:u w:val="none"/>
+        </w:rPr>
+        <w:t>etc</w:t>
+      </w:r>
+      <w:proofErr w:type="spellEnd"/>
+      <w:proofErr w:type="gramStart"/>
+      <w:r>
+        <w:rPr>
+          <w:spacing w:val="-10"/>
+          <w:sz w:val="24"/>
+          <w:szCs w:val="24"/>
+          <w:u w:val="none"/>
+        </w:rPr>
+        <w:t xml:space="preserve"> ….</w:t>
+      </w:r>
+      <w:proofErr w:type="gramEnd"/>
+      <w:r>
+        <w:rPr>
+          <w:spacing w:val="-10"/>
+          <w:sz w:val="24"/>
+          <w:szCs w:val="24"/>
+          <w:u w:val="none"/>
+        </w:rPr>
+        <w:t>.</w:t>
+      </w:r>
+    </w:p>
+    <w:p>
+      <w:pPr>
+        <w:pStyle w:val="Titre1"/>
+        <w:spacing w:before="1"/>
+        <w:jc w:val="both"/>
+        <w:rPr>
+          <w:spacing w:val="-10"/>
+          <w:sz w:val="24"/>
+          <w:szCs w:val="24"/>
+          <w:u w:val="none"/>
+        </w:rPr>
+      </w:pPr>
+    </w:p>
+    <w:p>
+      <w:pPr>
+        <w:pStyle w:val="Titre1"/>
+        <w:spacing w:before="1"/>
+        <w:jc w:val="both"/>
+        <w:rPr>
+          <w:spacing w:val="-10"/>
+          <w:sz w:val="24"/>
+          <w:szCs w:val="24"/>
+          <w:u w:val="none"/>
+        </w:rPr>
+      </w:pPr>
+      <w:r>
+        <w:rPr>
+          <w:spacing w:val="-10"/>
+          <w:sz w:val="24"/>
+          <w:szCs w:val="24"/>
+          <w:u w:val="none"/>
+        </w:rPr>
+        <w:t xml:space="preserve">Dans le monde du Web, plusieurs </w:t>
+      </w:r>
+      <w:proofErr w:type="spellStart"/>
+      <w:r>
+        <w:rPr>
+          <w:spacing w:val="-10"/>
+          <w:sz w:val="24"/>
+          <w:szCs w:val="24"/>
+          <w:u w:val="none"/>
+        </w:rPr>
+        <w:t>frameworks</w:t>
+      </w:r>
+      <w:proofErr w:type="spellEnd"/>
+      <w:r>
+        <w:rPr>
+          <w:spacing w:val="-10"/>
+          <w:sz w:val="24"/>
+          <w:szCs w:val="24"/>
+          <w:u w:val="none"/>
+        </w:rPr>
+        <w:t xml:space="preserve"> sont utilisés pour plusieurs usages </w:t>
+      </w:r>
+      <w:r>
+        <w:rPr>
+          <w:spacing w:val="-10"/>
+          <w:sz w:val="24"/>
+          <w:szCs w:val="24"/>
+          <w:u w:val="none"/>
+        </w:rPr>
+        <w:t>et via plusieurs langages qui ne sont pas forcément du web :</w:t>
+      </w:r>
+    </w:p>
+    <w:p>
+      <w:pPr>
+        <w:pStyle w:val="Titre1"/>
+        <w:spacing w:before="1"/>
+        <w:jc w:val="both"/>
+        <w:rPr>
+          <w:spacing w:val="-10"/>
+          <w:sz w:val="24"/>
+          <w:szCs w:val="24"/>
+          <w:u w:val="none"/>
+        </w:rPr>
+      </w:pPr>
+    </w:p>
+    <w:p>
+      <w:pPr>
+        <w:pStyle w:val="Titre1"/>
+        <w:spacing w:before="1"/>
+        <w:jc w:val="both"/>
+        <w:rPr>
+          <w:spacing w:val="-10"/>
+          <w:sz w:val="24"/>
+          <w:szCs w:val="24"/>
+          <w:u w:val="none"/>
+        </w:rPr>
+      </w:pPr>
+    </w:p>
+    <w:p>
+      <w:pPr>
+        <w:pStyle w:val="Titre1"/>
+        <w:spacing w:before="1"/>
+        <w:jc w:val="both"/>
+        <w:rPr>
+          <w:color w:val="1F497D" w:themeColor="text2"/>
+          <w:spacing w:val="-10"/>
+          <w:sz w:val="24"/>
+          <w:szCs w:val="24"/>
+          <w:u w:val="none"/>
+        </w:rPr>
+      </w:pPr>
+      <w:r>
+        <w:rPr>
+          <w:color w:val="1F497D" w:themeColor="text2"/>
+          <w:spacing w:val="-10"/>
+          <w:sz w:val="24"/>
+          <w:szCs w:val="24"/>
+          <w:u w:val="none"/>
+        </w:rPr>
+        <w:lastRenderedPageBreak/>
         <w:t>Python :</w:t>
       </w:r>
+    </w:p>
+    <w:p>
+      <w:pPr>
+        <w:pStyle w:val="Titre1"/>
+        <w:spacing w:before="1"/>
+        <w:jc w:val="both"/>
+        <w:rPr>
+          <w:spacing w:val="-10"/>
+          <w:sz w:val="24"/>
+          <w:szCs w:val="24"/>
+          <w:u w:val="none"/>
+        </w:rPr>
+      </w:pPr>
     </w:p>
     <w:p>
       <w:pPr>
@@ -2194,6 +1087,7 @@
       </w:pPr>
       <w:r>
         <w:rPr>
+          <w:color w:val="00B050"/>
           <w:sz w:val="24"/>
           <w:szCs w:val="24"/>
         </w:rPr>
@@ -2201,6 +1095,7 @@
       </w:r>
       <w:r>
         <w:rPr>
+          <w:color w:val="00B050"/>
           <w:spacing w:val="-17"/>
           <w:sz w:val="24"/>
           <w:szCs w:val="24"/>
@@ -3374,16 +2269,17 @@
         <w:ind w:left="141" w:right="133"/>
         <w:jc w:val="both"/>
         <w:rPr>
-          <w:sz w:val="24"/>
-          <w:szCs w:val="24"/>
-        </w:rPr>
-      </w:pPr>
-      <w:r>
-        <w:rPr>
-          <w:sz w:val="24"/>
-          <w:szCs w:val="24"/>
-        </w:rPr>
-        <w:lastRenderedPageBreak/>
+          <w:color w:val="1F497D" w:themeColor="text2"/>
+          <w:sz w:val="24"/>
+          <w:szCs w:val="24"/>
+        </w:rPr>
+      </w:pPr>
+      <w:r>
+        <w:rPr>
+          <w:color w:val="1F497D" w:themeColor="text2"/>
+          <w:sz w:val="24"/>
+          <w:szCs w:val="24"/>
+        </w:rPr>
         <w:t>JavaScript :</w:t>
       </w:r>
     </w:p>
@@ -3412,6 +2308,7 @@
       </w:pPr>
       <w:r>
         <w:rPr>
+          <w:color w:val="00B050"/>
           <w:sz w:val="24"/>
           <w:szCs w:val="24"/>
         </w:rPr>
@@ -3419,6 +2316,7 @@
       </w:r>
       <w:r>
         <w:rPr>
+          <w:color w:val="00B050"/>
           <w:spacing w:val="-22"/>
           <w:sz w:val="24"/>
           <w:szCs w:val="24"/>
@@ -4023,6 +2921,7 @@
         <w:ind w:left="141" w:right="134"/>
         <w:jc w:val="both"/>
         <w:rPr>
+          <w:color w:val="00B050"/>
           <w:sz w:val="24"/>
           <w:szCs w:val="24"/>
         </w:rPr>
@@ -4030,6 +2929,7 @@
       <w:proofErr w:type="spellStart"/>
       <w:r>
         <w:rPr>
+          <w:color w:val="00B050"/>
           <w:sz w:val="24"/>
           <w:szCs w:val="24"/>
         </w:rPr>
@@ -4063,6 +2963,7 @@
       <w:proofErr w:type="spellStart"/>
       <w:r>
         <w:rPr>
+          <w:color w:val="00B050"/>
           <w:sz w:val="24"/>
           <w:szCs w:val="24"/>
         </w:rPr>
@@ -4071,6 +2972,7 @@
       <w:proofErr w:type="spellEnd"/>
       <w:r>
         <w:rPr>
+          <w:color w:val="00B050"/>
           <w:sz w:val="24"/>
           <w:szCs w:val="24"/>
         </w:rPr>
@@ -4078,10 +2980,18 @@
       </w:r>
       <w:r>
         <w:rPr>
-          <w:sz w:val="24"/>
-          <w:szCs w:val="24"/>
-        </w:rPr>
-        <w:t xml:space="preserve"> est un </w:t>
+          <w:color w:val="00B050"/>
+          <w:sz w:val="24"/>
+          <w:szCs w:val="24"/>
+        </w:rPr>
+        <w:t xml:space="preserve"> </w:t>
+      </w:r>
+      <w:r>
+        <w:rPr>
+          <w:sz w:val="24"/>
+          <w:szCs w:val="24"/>
+        </w:rPr>
+        <w:t xml:space="preserve">est un </w:t>
       </w:r>
       <w:proofErr w:type="spellStart"/>
       <w:r>
@@ -4203,7 +3113,6 @@
         <w:rPr>
           <w:sz w:val="24"/>
           <w:szCs w:val="24"/>
-          <w:lang w:val="en-US"/>
         </w:rPr>
       </w:pPr>
     </w:p>
@@ -4214,6 +3123,7 @@
         <w:ind w:left="141" w:right="134"/>
         <w:jc w:val="both"/>
         <w:rPr>
+          <w:color w:val="00B050"/>
           <w:sz w:val="24"/>
           <w:szCs w:val="24"/>
         </w:rPr>
@@ -4221,6 +3131,7 @@
       <w:proofErr w:type="spellStart"/>
       <w:r>
         <w:rPr>
+          <w:color w:val="00B050"/>
           <w:sz w:val="24"/>
           <w:szCs w:val="24"/>
         </w:rPr>
@@ -4265,17 +3176,18 @@
       </w:pPr>
       <w:r>
         <w:rPr>
-          <w:sz w:val="24"/>
-          <w:szCs w:val="24"/>
-        </w:rPr>
-        <w:t>Flutter</w:t>
-      </w:r>
-      <w:r>
-        <w:rPr>
-          <w:sz w:val="24"/>
-          <w:szCs w:val="24"/>
-        </w:rPr>
-        <w:t xml:space="preserve"> est assez particulier c</w:t>
+          <w:color w:val="00B050"/>
+          <w:sz w:val="24"/>
+          <w:szCs w:val="24"/>
+        </w:rPr>
+        <w:t xml:space="preserve">Flutter </w:t>
+      </w:r>
+      <w:r>
+        <w:rPr>
+          <w:sz w:val="24"/>
+          <w:szCs w:val="24"/>
+        </w:rPr>
+        <w:t>est assez particulier c</w:t>
       </w:r>
       <w:r>
         <w:rPr>
@@ -4490,55 +3402,34 @@
     <w:p>
       <w:pPr>
         <w:pStyle w:val="Corpsdetexte"/>
-        <w:spacing w:before="1" w:line="295" w:lineRule="auto"/>
-        <w:ind w:left="141" w:right="139"/>
+        <w:spacing w:before="90"/>
+        <w:ind w:left="141"/>
         <w:jc w:val="both"/>
         <w:rPr>
-          <w:sz w:val="24"/>
-          <w:szCs w:val="24"/>
-        </w:rPr>
-      </w:pPr>
-    </w:p>
-    <w:p>
-      <w:pPr>
-        <w:pStyle w:val="Corpsdetexte"/>
-        <w:spacing w:before="1" w:line="295" w:lineRule="auto"/>
-        <w:ind w:left="141" w:right="139"/>
-        <w:jc w:val="both"/>
-        <w:rPr>
-          <w:sz w:val="24"/>
-          <w:szCs w:val="24"/>
-        </w:rPr>
-      </w:pPr>
-    </w:p>
-    <w:p>
-      <w:pPr>
-        <w:pStyle w:val="Corpsdetexte"/>
-        <w:spacing w:before="1" w:line="295" w:lineRule="auto"/>
-        <w:ind w:left="141" w:right="139"/>
-        <w:jc w:val="both"/>
-        <w:rPr>
-          <w:sz w:val="24"/>
-          <w:szCs w:val="24"/>
-        </w:rPr>
-      </w:pPr>
-    </w:p>
-    <w:p>
-      <w:pPr>
-        <w:pStyle w:val="Corpsdetexte"/>
-        <w:spacing w:before="1" w:line="295" w:lineRule="auto"/>
-        <w:ind w:left="141" w:right="139"/>
-        <w:jc w:val="both"/>
-        <w:rPr>
-          <w:sz w:val="24"/>
-          <w:szCs w:val="24"/>
-        </w:rPr>
-        <w:sectPr>
-          <w:pgSz w:w="11910" w:h="16840"/>
-          <w:pgMar w:top="1320" w:right="1275" w:bottom="1580" w:left="1275" w:header="706" w:footer="1382" w:gutter="0"/>
-          <w:cols w:space="720"/>
-        </w:sectPr>
-      </w:pPr>
+          <w:spacing w:val="-6"/>
+        </w:rPr>
+      </w:pPr>
+      <w:r>
+        <w:rPr>
+          <w:spacing w:val="-6"/>
+        </w:rPr>
+        <w:lastRenderedPageBreak/>
+        <w:t xml:space="preserve">Comparaison des différents </w:t>
+      </w:r>
+      <w:proofErr w:type="spellStart"/>
+      <w:r>
+        <w:rPr>
+          <w:spacing w:val="-6"/>
+        </w:rPr>
+        <w:t>frameworks</w:t>
+      </w:r>
+      <w:proofErr w:type="spellEnd"/>
+      <w:r>
+        <w:rPr>
+          <w:spacing w:val="-6"/>
+        </w:rPr>
+        <w:t> :</w:t>
+      </w:r>
     </w:p>
     <w:p>
       <w:pPr>
@@ -4548,29 +3439,10 @@
         <w:jc w:val="both"/>
         <w:rPr>
           <w:spacing w:val="-6"/>
-        </w:rPr>
-      </w:pPr>
-      <w:r>
-        <w:rPr>
-          <w:spacing w:val="-6"/>
-        </w:rPr>
-        <w:lastRenderedPageBreak/>
-        <w:t xml:space="preserve">Comparaison des différents </w:t>
-      </w:r>
-      <w:proofErr w:type="spellStart"/>
-      <w:r>
-        <w:rPr>
-          <w:spacing w:val="-6"/>
-        </w:rPr>
-        <w:t>frameworks</w:t>
-      </w:r>
-      <w:proofErr w:type="spellEnd"/>
-      <w:r>
-        <w:rPr>
-          <w:spacing w:val="-6"/>
-        </w:rPr>
-        <w:t> :</w:t>
-      </w:r>
+          <w:sz w:val="24"/>
+          <w:szCs w:val="24"/>
+        </w:rPr>
+      </w:pPr>
     </w:p>
     <w:p>
       <w:pPr>
@@ -4579,240 +3451,35 @@
         <w:ind w:left="141"/>
         <w:jc w:val="both"/>
         <w:rPr>
+          <w:sz w:val="24"/>
+          <w:szCs w:val="24"/>
+        </w:rPr>
+      </w:pPr>
+      <w:r>
+        <w:rPr>
           <w:spacing w:val="-6"/>
           <w:sz w:val="24"/>
           <w:szCs w:val="24"/>
         </w:rPr>
-      </w:pPr>
-    </w:p>
-    <w:p>
-      <w:pPr>
-        <w:pStyle w:val="Corpsdetexte"/>
-        <w:spacing w:before="90"/>
-        <w:ind w:left="141"/>
-        <w:jc w:val="both"/>
-        <w:rPr>
-          <w:sz w:val="24"/>
-          <w:szCs w:val="24"/>
-        </w:rPr>
-      </w:pPr>
+        <w:t xml:space="preserve">Pour utiliser ces </w:t>
+      </w:r>
+      <w:proofErr w:type="spellStart"/>
       <w:r>
         <w:rPr>
           <w:spacing w:val="-6"/>
           <w:sz w:val="24"/>
           <w:szCs w:val="24"/>
         </w:rPr>
-        <w:t>Mais</w:t>
-      </w:r>
-      <w:r>
-        <w:rPr>
-          <w:spacing w:val="-22"/>
-          <w:sz w:val="24"/>
-          <w:szCs w:val="24"/>
-        </w:rPr>
-        <w:t xml:space="preserve"> </w:t>
-      </w:r>
+        <w:t>frameworks</w:t>
+      </w:r>
+      <w:proofErr w:type="spellEnd"/>
       <w:r>
         <w:rPr>
           <w:spacing w:val="-6"/>
           <w:sz w:val="24"/>
           <w:szCs w:val="24"/>
         </w:rPr>
-        <w:t>pour</w:t>
-      </w:r>
-      <w:r>
-        <w:rPr>
-          <w:spacing w:val="-22"/>
-          <w:sz w:val="24"/>
-          <w:szCs w:val="24"/>
-        </w:rPr>
-        <w:t xml:space="preserve"> </w:t>
-      </w:r>
-      <w:r>
-        <w:rPr>
-          <w:spacing w:val="-6"/>
-          <w:sz w:val="24"/>
-          <w:szCs w:val="24"/>
-        </w:rPr>
-        <w:t>être</w:t>
-      </w:r>
-      <w:r>
-        <w:rPr>
-          <w:spacing w:val="-18"/>
-          <w:sz w:val="24"/>
-          <w:szCs w:val="24"/>
-        </w:rPr>
-        <w:t xml:space="preserve"> </w:t>
-      </w:r>
-      <w:r>
-        <w:rPr>
-          <w:spacing w:val="-6"/>
-          <w:sz w:val="24"/>
-          <w:szCs w:val="24"/>
-        </w:rPr>
-        <w:t>à</w:t>
-      </w:r>
-      <w:r>
-        <w:rPr>
-          <w:spacing w:val="-20"/>
-          <w:sz w:val="24"/>
-          <w:szCs w:val="24"/>
-        </w:rPr>
-        <w:t xml:space="preserve"> </w:t>
-      </w:r>
-      <w:r>
-        <w:rPr>
-          <w:spacing w:val="-6"/>
-          <w:sz w:val="24"/>
-          <w:szCs w:val="24"/>
-        </w:rPr>
-        <w:t>l’aise</w:t>
-      </w:r>
-      <w:r>
-        <w:rPr>
-          <w:spacing w:val="-19"/>
-          <w:sz w:val="24"/>
-          <w:szCs w:val="24"/>
-        </w:rPr>
-        <w:t xml:space="preserve"> </w:t>
-      </w:r>
-      <w:r>
-        <w:rPr>
-          <w:spacing w:val="-6"/>
-          <w:sz w:val="24"/>
-          <w:szCs w:val="24"/>
-        </w:rPr>
-        <w:t>avec</w:t>
-      </w:r>
-      <w:r>
-        <w:rPr>
-          <w:spacing w:val="-23"/>
-          <w:sz w:val="24"/>
-          <w:szCs w:val="24"/>
-        </w:rPr>
-        <w:t xml:space="preserve"> </w:t>
-      </w:r>
-      <w:r>
-        <w:rPr>
-          <w:spacing w:val="-6"/>
-          <w:sz w:val="24"/>
-          <w:szCs w:val="24"/>
-        </w:rPr>
-        <w:t>l’un</w:t>
-      </w:r>
-      <w:r>
-        <w:rPr>
-          <w:spacing w:val="-20"/>
-          <w:sz w:val="24"/>
-          <w:szCs w:val="24"/>
-        </w:rPr>
-        <w:t xml:space="preserve"> </w:t>
-      </w:r>
-      <w:r>
-        <w:rPr>
-          <w:spacing w:val="-6"/>
-          <w:sz w:val="24"/>
-          <w:szCs w:val="24"/>
-        </w:rPr>
-        <w:t>des</w:t>
-      </w:r>
-      <w:r>
-        <w:rPr>
-          <w:spacing w:val="-21"/>
-          <w:sz w:val="24"/>
-          <w:szCs w:val="24"/>
-        </w:rPr>
-        <w:t xml:space="preserve"> </w:t>
-      </w:r>
-      <w:r>
-        <w:rPr>
-          <w:spacing w:val="-6"/>
-          <w:sz w:val="24"/>
-          <w:szCs w:val="24"/>
-        </w:rPr>
-        <w:t>deux</w:t>
-      </w:r>
-      <w:r>
-        <w:rPr>
-          <w:spacing w:val="-19"/>
-          <w:sz w:val="24"/>
-          <w:szCs w:val="24"/>
-        </w:rPr>
-        <w:t xml:space="preserve"> </w:t>
-      </w:r>
-      <w:proofErr w:type="spellStart"/>
-      <w:r>
-        <w:rPr>
-          <w:spacing w:val="-6"/>
-          <w:sz w:val="24"/>
-          <w:szCs w:val="24"/>
-        </w:rPr>
-        <w:t>Frameworks</w:t>
-      </w:r>
-      <w:proofErr w:type="spellEnd"/>
-      <w:r>
-        <w:rPr>
-          <w:spacing w:val="-21"/>
-          <w:sz w:val="24"/>
-          <w:szCs w:val="24"/>
-        </w:rPr>
-        <w:t xml:space="preserve"> </w:t>
-      </w:r>
-      <w:r>
-        <w:rPr>
-          <w:spacing w:val="-6"/>
-          <w:sz w:val="24"/>
-          <w:szCs w:val="24"/>
-        </w:rPr>
-        <w:t>voici</w:t>
-      </w:r>
-      <w:r>
-        <w:rPr>
-          <w:spacing w:val="-20"/>
-          <w:sz w:val="24"/>
-          <w:szCs w:val="24"/>
-        </w:rPr>
-        <w:t xml:space="preserve"> </w:t>
-      </w:r>
-      <w:r>
-        <w:rPr>
-          <w:spacing w:val="-6"/>
-          <w:sz w:val="24"/>
-          <w:szCs w:val="24"/>
-        </w:rPr>
-        <w:t>les</w:t>
-      </w:r>
-      <w:r>
-        <w:rPr>
-          <w:spacing w:val="-16"/>
-          <w:sz w:val="24"/>
-          <w:szCs w:val="24"/>
-        </w:rPr>
-        <w:t xml:space="preserve"> </w:t>
-      </w:r>
-      <w:r>
-        <w:rPr>
-          <w:spacing w:val="-6"/>
-          <w:sz w:val="24"/>
-          <w:szCs w:val="24"/>
-        </w:rPr>
-        <w:t>prérequis</w:t>
-      </w:r>
-      <w:r>
-        <w:rPr>
-          <w:spacing w:val="-18"/>
-          <w:sz w:val="24"/>
-          <w:szCs w:val="24"/>
-        </w:rPr>
-        <w:t xml:space="preserve"> </w:t>
-      </w:r>
-      <w:r>
-        <w:rPr>
-          <w:spacing w:val="-10"/>
-          <w:sz w:val="24"/>
-          <w:szCs w:val="24"/>
-        </w:rPr>
-        <w:t>:</w:t>
+        <w:t xml:space="preserve"> il faut avoir quelques prérequis :</w:t>
       </w:r>
     </w:p>
     <w:p>
@@ -6385,6 +5052,8 @@
       </w:r>
     </w:p>
     <w:sectPr>
+      <w:headerReference w:type="default" r:id="rId6"/>
+      <w:footerReference w:type="default" r:id="rId7"/>
       <w:pgSz w:w="11910" w:h="16840"/>
       <w:pgMar w:top="1320" w:right="1275" w:bottom="1580" w:left="1275" w:header="706" w:footer="1382" w:gutter="0"/>
       <w:cols w:space="720"/>
@@ -6430,7 +5099,7 @@
       <mc:AlternateContent>
         <mc:Choice Requires="wps">
           <w:drawing>
-            <wp:anchor distT="0" distB="0" distL="0" distR="0" simplePos="0" relativeHeight="251658752" behindDoc="1" locked="0" layoutInCell="1" allowOverlap="1" wp14:anchorId="68C0B83C" wp14:editId="4468B328">
+            <wp:anchor distT="0" distB="0" distL="0" distR="0" simplePos="0" relativeHeight="251657216" behindDoc="1" locked="0" layoutInCell="1" allowOverlap="1" wp14:anchorId="68C0B83C" wp14:editId="4468B328">
               <wp:simplePos x="0" y="0"/>
               <wp:positionH relativeFrom="page">
                 <wp:posOffset>3448050</wp:posOffset>
@@ -6601,7 +5270,7 @@
               <v:stroke joinstyle="miter"/>
               <v:path gradientshapeok="t" o:connecttype="rect"/>
             </v:shapetype>
-            <v:shape id="Textbox 2" o:spid="_x0000_s1027" type="#_x0000_t202" style="position:absolute;margin-left:271.5pt;margin-top:761.7pt;width:52.85pt;height:16.65pt;z-index:-251657728;visibility:visible;mso-wrap-style:square;mso-wrap-distance-left:0;mso-wrap-distance-top:0;mso-wrap-distance-right:0;mso-wrap-distance-bottom:0;mso-position-horizontal:absolute;mso-position-horizontal-relative:page;mso-position-vertical:absolute;mso-position-vertical-relative:page;v-text-anchor:top" o:gfxdata="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" filled="f" stroked="f">
+            <v:shape id="Textbox 2" o:spid="_x0000_s1027" type="#_x0000_t202" style="position:absolute;margin-left:271.5pt;margin-top:761.7pt;width:52.85pt;height:16.65pt;z-index:-251659264;visibility:visible;mso-wrap-style:square;mso-wrap-distance-left:0;mso-wrap-distance-top:0;mso-wrap-distance-right:0;mso-wrap-distance-bottom:0;mso-position-horizontal:absolute;mso-position-horizontal-relative:page;mso-position-vertical:absolute;mso-position-vertical-relative:page;v-text-anchor:top" o:gfxdata="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" filled="f" stroked="f">
               <v:textbox inset="0,0,0,0">
                 <w:txbxContent>
                   <w:p>
@@ -6742,7 +5411,7 @@
       <mc:AlternateContent>
         <mc:Choice Requires="wps">
           <w:drawing>
-            <wp:anchor distT="0" distB="0" distL="0" distR="0" simplePos="0" relativeHeight="251661824" behindDoc="1" locked="0" layoutInCell="1" allowOverlap="1" wp14:anchorId="7FADEBCE" wp14:editId="4E3C3BB7">
+            <wp:anchor distT="0" distB="0" distL="0" distR="0" simplePos="0" relativeHeight="251659264" behindDoc="1" locked="0" layoutInCell="1" allowOverlap="1" wp14:anchorId="7FADEBCE" wp14:editId="4E3C3BB7">
               <wp:simplePos x="0" y="0"/>
               <wp:positionH relativeFrom="page">
                 <wp:posOffset>3167633</wp:posOffset>
@@ -6817,7 +5486,7 @@
         </mc:Choice>
         <mc:Fallback>
           <w:pict>
-            <v:shape w14:anchorId="7FADEBCE" id="Textbox 3" o:spid="_x0000_s1028" type="#_x0000_t202" style="position:absolute;margin-left:249.4pt;margin-top:791pt;width:96.55pt;height:16.65pt;z-index:-251654656;visibility:visible;mso-wrap-style:square;mso-wrap-distance-left:0;mso-wrap-distance-top:0;mso-wrap-distance-right:0;mso-wrap-distance-bottom:0;mso-position-horizontal:absolute;mso-position-horizontal-relative:page;mso-position-vertical:absolute;mso-position-vertical-relative:page;v-text-anchor:top" o:gfxdata="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" filled="f" stroked="f">
+            <v:shape w14:anchorId="7FADEBCE" id="Textbox 3" o:spid="_x0000_s1028" type="#_x0000_t202" style="position:absolute;margin-left:249.4pt;margin-top:791pt;width:96.55pt;height:16.65pt;z-index:-251657216;visibility:visible;mso-wrap-style:square;mso-wrap-distance-left:0;mso-wrap-distance-top:0;mso-wrap-distance-right:0;mso-wrap-distance-bottom:0;mso-position-horizontal:absolute;mso-position-horizontal-relative:page;mso-position-vertical:absolute;mso-position-vertical-relative:page;v-text-anchor:top" o:gfxdata="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" filled="f" stroked="f">
               <v:textbox inset="0,0,0,0">
                 <w:txbxContent>
                   <w:p>
@@ -6899,7 +5568,7 @@
       <mc:AlternateContent>
         <mc:Choice Requires="wps">
           <w:drawing>
-            <wp:anchor distT="0" distB="0" distL="0" distR="0" simplePos="0" relativeHeight="251655680" behindDoc="1" locked="0" layoutInCell="1" allowOverlap="1" wp14:anchorId="537EEDC7" wp14:editId="4774D94A">
+            <wp:anchor distT="0" distB="0" distL="0" distR="0" simplePos="0" relativeHeight="251655168" behindDoc="1" locked="0" layoutInCell="1" allowOverlap="1" wp14:anchorId="537EEDC7" wp14:editId="4774D94A">
               <wp:simplePos x="0" y="0"/>
               <wp:positionH relativeFrom="page">
                 <wp:posOffset>886764</wp:posOffset>
@@ -7055,7 +5724,7 @@
               <v:stroke joinstyle="miter"/>
               <v:path gradientshapeok="t" o:connecttype="rect"/>
             </v:shapetype>
-            <v:shape id="Textbox 1" o:spid="_x0000_s1026" type="#_x0000_t202" style="position:absolute;margin-left:69.8pt;margin-top:34.3pt;width:201.7pt;height:16.65pt;z-index:-251660800;visibility:visible;mso-wrap-style:square;mso-wrap-distance-left:0;mso-wrap-distance-top:0;mso-wrap-distance-right:0;mso-wrap-distance-bottom:0;mso-position-horizontal:absolute;mso-position-horizontal-relative:page;mso-position-vertical:absolute;mso-position-vertical-relative:page;v-text-anchor:top" o:gfxdata="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" filled="f" stroked="f">
+            <v:shape id="Textbox 1" o:spid="_x0000_s1026" type="#_x0000_t202" style="position:absolute;margin-left:69.8pt;margin-top:34.3pt;width:201.7pt;height:16.65pt;z-index:-251661312;visibility:visible;mso-wrap-style:square;mso-wrap-distance-left:0;mso-wrap-distance-top:0;mso-wrap-distance-right:0;mso-wrap-distance-bottom:0;mso-position-horizontal:absolute;mso-position-horizontal-relative:page;mso-position-vertical:absolute;mso-position-vertical-relative:page;v-text-anchor:top" o:gfxdata="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" filled="f" stroked="f">
               <v:textbox inset="0,0,0,0">
                 <w:txbxContent>
                   <w:p>
@@ -7600,7 +6269,6 @@
   <w:style w:type="character" w:default="1" w:styleId="Policepardfaut">
     <w:name w:val="Default Paragraph Font"/>
     <w:uiPriority w:val="1"/>
-    <w:semiHidden/>
     <w:unhideWhenUsed/>
   </w:style>
   <w:style w:type="table" w:default="1" w:styleId="TableauNormal">
@@ -7675,6 +6343,29 @@
     <w:basedOn w:val="Normal"/>
     <w:uiPriority w:val="1"/>
     <w:qFormat/>
+  </w:style>
+  <w:style w:type="character" w:styleId="Lienhypertexte">
+    <w:name w:val="Hyperlink"/>
+    <w:basedOn w:val="Policepardfaut"/>
+    <w:uiPriority w:val="99"/>
+    <w:unhideWhenUsed/>
+    <w:rsid w:val="0067798F"/>
+    <w:rPr>
+      <w:color w:val="0000FF" w:themeColor="hyperlink"/>
+      <w:u w:val="single"/>
+    </w:rPr>
+  </w:style>
+  <w:style w:type="character" w:styleId="Mentionnonrsolue">
+    <w:name w:val="Unresolved Mention"/>
+    <w:basedOn w:val="Policepardfaut"/>
+    <w:uiPriority w:val="99"/>
+    <w:semiHidden/>
+    <w:unhideWhenUsed/>
+    <w:rsid w:val="0067798F"/>
+    <w:rPr>
+      <w:color w:val="605E5C"/>
+      <w:shd w:val="clear" w:color="auto" w:fill="E1DFDD"/>
+    </w:rPr>
   </w:style>
 </w:styles>
 </file>

</xml_diff>